<commit_message>
docs(tcc): artigo ajustado ao parecer da orientadora (ABNT e projetos semelhantes)
- citações no padrão da NBR 10520:2023 (Brasil, 2015), Inep por extenso na 1ª menção
- referências na NBR 6023: leis com [ano], URL e acesso; DOU na Res. CNS 510;
  local dos periódicos; Prodanov pelo repositório da Feevale; URLs sem < >
- código como "Código 1", listagem numerada em fonte monoespaçada; figuras renumeradas
- seções dos diagramas sem "Diagrama N"; SVG embutido no .docx junto do PNG
- nota de autoria com curso, instituição, cidade, estado e país
- projetos semelhantes conferidos em 13/10/2026: Vínculoo agora adapta com IA,
  Prova Adaptada responde como IncluiAI; Quadro 1 e discussão corrigidos

Co-Authored-By: Claude Opus 5.5 (1M context) <noreply@anthropic.com>
</commit_message>
<xml_diff>
--- a/docs/tcc/artigo/Artigo_PEI_Vivo_v2.docx
+++ b/docs/tcc/artigo/Artigo_PEI_Vivo_v2.docx
@@ -539,7 +539,7 @@
           <w:i w:val="0"/>
           <w:sz w:val="20"/>
         </w:rPr>
-        <w:t>Discente do Curso de Sistemas de Informação. E-mail: geandre51@gmail.com</w:t>
+        <w:t>Discente do Curso de Bacharelado em Sistemas de Informação, Centro Universitário CEUNI – FAMETRO, Manaus, Amazonas, Brasil. E-mail: geandre51@gmail.com</w:t>
       </w:r>
     </w:p>
     <w:p>
@@ -561,7 +561,7 @@
           <w:i w:val="0"/>
           <w:sz w:val="20"/>
         </w:rPr>
-        <w:t>Discente do Curso de Sistemas de Informação. E-mail: jeanvictor.st29@gmail.com</w:t>
+        <w:t>Discente do Curso de Bacharelado em Sistemas de Informação, Centro Universitário CEUNI – FAMETRO, Manaus, Amazonas, Brasil. E-mail: jeanvictor.st29@gmail.com</w:t>
       </w:r>
     </w:p>
     <w:p>
@@ -583,7 +583,7 @@
           <w:i w:val="0"/>
           <w:sz w:val="20"/>
         </w:rPr>
-        <w:t>Docente do Curso de Sistemas de Informação. Orientadora. E-mail: prof.luanalealm@gmail.com</w:t>
+        <w:t>Docente e orientadora do Curso de Bacharelado em Sistemas de Informação, Centro Universitário CEUNI – FAMETRO, Manaus, Amazonas, Brasil. E-mail: prof.luanalealm@gmail.com</w:t>
       </w:r>
     </w:p>
     <w:p>
@@ -771,7 +771,7 @@
           <w:i w:val="0"/>
           <w:sz w:val="24"/>
         </w:rPr>
-        <w:t>O crescimento das matrículas da Educação Especial no Brasil evidencia um avanço expressivo no acesso à escolarização de estudantes com deficiência e transtornos do neurodesenvolvimento: em 2025, essas matrículas alcançaram 2,5 milhões, um aumento de 82% em relação a 2021, com mais de 90% dos estudantes já inseridos em classes comuns do ensino regular (INSTITUTO NACIONAL DE ESTUDOS E PESQUISAS EDUCACIONAIS ANÍSIO TEIXEIRA, 2026). Esse avanço, contudo, não veio acompanhado de igual fortalecimento da estrutura pedagógica necessária para sustentar a permanência desses estudantes com aprendizagem efetiva: o mesmo levantamento indica que apenas 11,3% das equipes gestoras escolares possuem formação continuada específica em Educação Especial.</w:t>
+        <w:t>O crescimento das matrículas da Educação Especial no Brasil evidencia um avanço expressivo no acesso à escolarização de estudantes com deficiência e transtornos do neurodesenvolvimento: em 2025, essas matrículas alcançaram 2,5 milhões, um aumento de 82% em relação a 2021, com mais de 90% dos estudantes já inseridos em classes comuns do ensino regular, segundo o Censo Escolar do Instituto Nacional de Estudos e Pesquisas Educacionais Anísio Teixeira (Inep, 2026). Esse avanço, contudo, não veio acompanhado de igual fortalecimento da estrutura pedagógica necessária para sustentar a permanência desses estudantes com aprendizagem efetiva: o mesmo levantamento indica que apenas 11,3% das equipes gestoras escolares possuem formação continuada específica em Educação Especial.</w:t>
       </w:r>
     </w:p>
     <w:p>
@@ -787,7 +787,7 @@
           <w:i w:val="0"/>
           <w:sz w:val="24"/>
         </w:rPr>
-        <w:t>O principal instrumento previsto para responder a essa demanda é o Plano Educacional Individualizado (PEI), cujo amparo legal decorre da Lei Brasileira de Inclusão da Pessoa com Deficiência, Lei nº 13.146 (BRASIL, 2015). A literatura nacional recente, entretanto, é convergente ao apontar a baixa operacionalização desse instrumento na prática escolar. Segundo Silva e Camargo (2021), o PEI é concebido, em tese, como processo colaborativo, mas frequentemente se converte em documento burocrático elaborado uma única vez por período letivo. Pereira (2022) e Fontana e Cruz (2022) reforçam esse diagnóstico ao descreverem a dificuldade de professores em traduzir as diretrizes do plano em prática pedagógica cotidiana, enquanto Battistello, Lisboa e Martins (2024) e Modesto, Araújo e Mendonça (2023) associam essa lacuna à ausência de suporte tecnológico capaz de acompanhar a evolução do estudante ao longo do ano letivo.</w:t>
+        <w:t>O principal instrumento previsto para responder a essa demanda é o Plano Educacional Individualizado (PEI), cujo amparo legal decorre da Lei Brasileira de Inclusão da Pessoa com Deficiência, Lei nº 13.146 (Brasil, 2015). A literatura nacional recente, entretanto, é convergente ao apontar a baixa operacionalização desse instrumento na prática escolar. Segundo Silva e Camargo (2021), o PEI é concebido, em tese, como processo colaborativo, mas frequentemente se converte em documento burocrático elaborado uma única vez por período letivo. Pereira (2022) e Fontana e Cruz (2022) reforçam esse diagnóstico ao descreverem a dificuldade de professores em traduzir as diretrizes do plano em prática pedagógica cotidiana, enquanto Battistello, Lisboa e Martins (2024) e Modesto, Araújo e Mendonça (2023) associam essa lacuna à ausência de suporte tecnológico capaz de acompanhar a evolução do estudante ao longo do ano letivo.</w:t>
       </w:r>
     </w:p>
     <w:p>
@@ -803,7 +803,7 @@
           <w:i w:val="0"/>
           <w:sz w:val="24"/>
         </w:rPr>
-        <w:t>Especificamente para os casos de dislexia e Transtorno do Déficit de Atenção com Hiperatividade (TDAH), a Lei nº 14.254 (BRASIL, 2021) determina o acompanhamento integral do educando, com articulação entre a rede de ensino e a rede de saúde. No levantamento exploratório realizado neste trabalho (seção 3.1), 63,0% dos 27 respondentes descreveram a comunicação atual entre escola, família e saúde como informal e fragmentada, conduzida predominantemente por aplicativos de mensagens, sem histórico recuperável nem continuidade entre ciclos letivos. Por se tratar de amostra de conveniência, esse dado caracteriza o problema no grupo consultado, sem pretensão de generalização.</w:t>
+        <w:t>Especificamente para os casos de dislexia e Transtorno do Déficit de Atenção com Hiperatividade (TDAH), a Lei nº 14.254 (Brasil, 2021) determina o acompanhamento integral do educando, com articulação entre a rede de ensino e a rede de saúde. No levantamento exploratório realizado neste trabalho (seção 3.1), 63,0% dos 27 respondentes descreveram a comunicação atual entre escola, família e saúde como informal e fragmentada, conduzida predominantemente por aplicativos de mensagens, sem histórico recuperável nem continuidade entre ciclos letivos. Por se tratar de amostra de conveniência, esse dado caracteriza o problema no grupo consultado, sem pretensão de generalização.</w:t>
       </w:r>
     </w:p>
     <w:p>
@@ -973,7 +973,7 @@
           <w:i w:val="0"/>
           <w:sz w:val="24"/>
         </w:rPr>
-        <w:t>A relevância do tema sustenta-se em três dimensões complementares. No plano legal e social, o problema investigado corresponde a uma obrigação normativa vigente e ainda sem instrumento operacional, conforme a Lei nº 14.254/2021. No plano tecnológico, as soluções de mercado consultadas (seção 2.6) tratam a adaptação de conteúdo, a gestão documental do plano e a validação por profissional de saúde como problemas isolados, sem integrá-los em um único ciclo. No plano prático, um sistema como o PEI Vivo pode reduzir o esforço da adaptação docente e preservar o conhecimento sobre o estudante entre ciclos letivos e trocas de professor, uma vez que o perfil pertence ao estudante e não ao docente.</w:t>
+        <w:t>A relevância do tema sustenta-se em três dimensões complementares. No plano legal e social, o problema investigado corresponde a uma obrigação normativa vigente e ainda sem instrumento operacional, conforme a Lei nº 14.254/2021. No plano tecnológico, as soluções de mercado consultadas (seção 2.6) já combinam gestão do plano e adaptação de conteúdo por IA, mas nenhuma integra ao ciclo a validação por profissional de saúde nem oferece uma adaptação que funcione sem IA. No plano prático, um sistema como o PEI Vivo pode reduzir o esforço da adaptação docente e preservar o conhecimento sobre o estudante entre ciclos letivos e trocas de professor, uma vez que o perfil pertence ao estudante e não ao docente.</w:t>
       </w:r>
     </w:p>
     <w:p>
@@ -989,7 +989,7 @@
           <w:i w:val="0"/>
           <w:sz w:val="24"/>
         </w:rPr>
-        <w:t>Há ainda uma justificativa de proteção de dados. Informações sobre a saúde de crianças são dados pessoais sensíveis (BRASIL, 2018, art. 11) e exigem consentimento específico de pelo menos um dos pais ou responsável (BRASIL, 2018, art. 14). Um sistema que circula esse tipo de informação entre escola e saúde precisa demonstrar, e não apenas declarar, que cada pessoa acessa somente o necessário ao seu papel.</w:t>
+        <w:t>Há ainda uma justificativa de proteção de dados. Informações sobre a saúde de crianças são dados pessoais sensíveis (Brasil, 2018, art. 11) e exigem consentimento específico de pelo menos um dos pais ou responsável (Brasil, 2018, art. 14). Um sistema que circula esse tipo de informação entre escola e saúde precisa demonstrar, e não apenas declarar, que cada pessoa acessa somente o necessário ao seu papel.</w:t>
       </w:r>
     </w:p>
     <w:p>
@@ -1005,7 +1005,7 @@
           <w:i w:val="0"/>
           <w:sz w:val="24"/>
         </w:rPr>
-        <w:t>O trabalho relaciona-se aos Objetivos de Desenvolvimento Sustentável 4 (Educação de Qualidade), em especial à meta 4.5, que trata do acesso igualitário à educação para pessoas com deficiência, e 3 (Saúde e Bem-Estar), ao formalizar a participação da rede de saúde no acompanhamento escolar (ORGANIZAÇÃO DAS NAÇÕES UNIDAS, 2015). O sistema não mede bem-estar diretamente; a contribuição para o ODS 3 é de articulação entre serviços.</w:t>
+        <w:t>O trabalho relaciona-se aos Objetivos de Desenvolvimento Sustentável 4 (Educação de Qualidade), em especial à meta 4.5, que trata do acesso igualitário à educação para pessoas com deficiência, e 3 (Saúde e Bem-Estar), ao formalizar a participação da rede de saúde no acompanhamento escolar (Organização das Nações Unidas, 2015). O sistema não mede bem-estar diretamente; a contribuição para o ODS 3 é de articulação entre serviços.</w:t>
       </w:r>
     </w:p>
     <w:p>
@@ -1069,7 +1069,7 @@
           <w:i w:val="0"/>
           <w:sz w:val="24"/>
         </w:rPr>
-        <w:t>O Plano Educacional Individualizado é o instrumento central de personalização do ensino para estudantes público-alvo da Educação Especial, sendo amparado pela Lei Brasileira de Inclusão (BRASIL, 2015) e, para os casos de dislexia e TDAH, pela Lei nº 14.254 (BRASIL, 2021). Silva e Camargo (2021), em revisão integrativa da produção científica nacional sobre o tema, identificam que a elaboração colaborativa do plano é amplamente defendida na literatura, mas raramente sustentada por mecanismos que garantam sua atualização contínua. Pereira (2022) descreve desafios semelhantes ao analisar práticas colaborativas de ensino, enquanto Fontana e Cruz (2022) discutem a aplicação do PEI em componente curricular específico, evidenciando a dificuldade de tradução do plano em atividade prática replicável. Modesto, Araújo e Mendonça (2023) e Battistello, Lisboa e Martins (2024) convergem ao apontar que a ausência de suporte tecnológico dedicado é fator determinante para a baixa efetividade do instrumento.</w:t>
+        <w:t>O Plano Educacional Individualizado é o instrumento central de personalização do ensino para estudantes público-alvo da Educação Especial, sendo amparado pela Lei Brasileira de Inclusão (Brasil, 2015) e, para os casos de dislexia e TDAH, pela Lei nº 14.254 (Brasil, 2021). Silva e Camargo (2021), em revisão integrativa da produção científica nacional sobre o tema, identificam que a elaboração colaborativa do plano é amplamente defendida na literatura, mas raramente sustentada por mecanismos que garantam sua atualização contínua. Pereira (2022) descreve desafios semelhantes ao analisar práticas colaborativas de ensino, enquanto Fontana e Cruz (2022) discutem a aplicação do PEI em componente curricular específico, evidenciando a dificuldade de tradução do plano em atividade prática replicável. Modesto, Araújo e Mendonça (2023) e Battistello, Lisboa e Martins (2024) convergem ao apontar que a ausência de suporte tecnológico dedicado é fator determinante para a baixa efetividade do instrumento.</w:t>
       </w:r>
     </w:p>
     <w:p>
@@ -1101,7 +1101,7 @@
           <w:i w:val="0"/>
           <w:sz w:val="24"/>
         </w:rPr>
-        <w:t>O Transtorno do Espectro Autista (TEA), o TDAH e a dislexia são transtornos do neurodesenvolvimento com manifestações distintas, mas com efeitos convergentes sobre a leitura de materiais escolares (AMERICAN PSYCHIATRIC ASSOCIATION, 2023). No TDAH, a dificuldade de sustentar a atenção torna textos longos e enunciados com várias instruções encadeadas mais custosos. Na dislexia, a decodificação de palavras é mais lenta e menos precisa, o que aumenta o peso de vocabulário pouco frequente e de blocos densos de texto. No TEA, a sensibilidade sensorial e a preferência por instruções explícitas podem tornar relevantes o contraste visual, a previsibilidade da estrutura e o uso de interesses específicos como ponto de entrada.</w:t>
+        <w:t>O Transtorno do Espectro Autista (TEA), o TDAH e a dislexia são transtornos do neurodesenvolvimento com manifestações distintas, mas com efeitos convergentes sobre a leitura de materiais escolares (American Psychiatric Association, 2023). No TDAH, a dificuldade de sustentar a atenção torna textos longos e enunciados com várias instruções encadeadas mais custosos. Na dislexia, a decodificação de palavras é mais lenta e menos precisa, o que aumenta o peso de vocabulário pouco frequente e de blocos densos de texto. No TEA, a sensibilidade sensorial e a preferência por instruções explícitas podem tornar relevantes o contraste visual, a previsibilidade da estrutura e o uso de interesses específicos como ponto de entrada.</w:t>
       </w:r>
     </w:p>
     <w:p>
@@ -1165,7 +1165,7 @@
           <w:i w:val="0"/>
           <w:sz w:val="24"/>
         </w:rPr>
-        <w:t>Os limiares de contraste adotados (4,5:1 e 7:1) correspondem aos critérios de sucesso 1.4.3 (nível AA) e 1.4.6 (nível AAA) das WCAG 2.2 (WORLD WIDE WEB CONSORTIUM, 2024), também incorporadas à ABNT NBR 17225 (ASSOCIAÇÃO BRASILEIRA DE NORMAS TÉCNICAS, 2025). A preferência por fontes sem serifa e de formas bem diferenciadas encontra apoio em Rello e Baeza-Yates (2013), que mediram desempenho de leitura de pessoas com dislexia em diferentes fontes. Os demais limiares (número de linhas por bloco, níveis de vocabulário e quantidade de blocos por material) não têm valor de referência único na literatura consultada: são hipóteses de projeto, explícitas e ajustáveis pelo profissional de saúde, a serem calibradas no uso.</w:t>
+        <w:t>Os limiares de contraste adotados (4,5:1 e 7:1) correspondem aos critérios de sucesso 1.4.3 (nível AA) e 1.4.6 (nível AAA) das WCAG 2.2 (World Wide Web Consortium, 2024), também incorporadas à ABNT NBR 17225 (Associação Brasileira de Normas Técnicas, 2025). A preferência por fontes sem serifa e de formas bem diferenciadas encontra apoio em Rello e Baeza-Yates (2013), que mediram desempenho de leitura de pessoas com dislexia em diferentes fontes. Os demais limiares (número de linhas por bloco, níveis de vocabulário e quantidade de blocos por material) não têm valor de referência único na literatura consultada: são hipóteses de projeto, explícitas e ajustáveis pelo profissional de saúde, a serem calibradas no uso.</w:t>
       </w:r>
     </w:p>
     <w:p>
@@ -1197,7 +1197,7 @@
           <w:i w:val="0"/>
           <w:sz w:val="24"/>
         </w:rPr>
-        <w:t>O tratamento de dados de crianças e adolescentes com deficiência envolve dado pessoal sensível (BRASIL, 2018, art. 11) e exige consentimento específico e em destaque dado por pelo menos um dos pais ou pelo responsável legal (BRASIL, 2018, art. 14, § 1º). A lei também impõe os princípios da finalidade e da necessidade (BRASIL, 2018, art. 6º, I e III), segundo os quais cada pessoa deve acessar apenas o mínimo necessário à sua função.</w:t>
+        <w:t>O tratamento de dados de crianças e adolescentes com deficiência envolve dado pessoal sensível (Brasil, 2018, art. 11) e exige consentimento específico e em destaque dado por pelo menos um dos pais ou pelo responsável legal (Brasil, 2018, art. 14, § 1º). A lei também impõe os princípios da finalidade e da necessidade (Brasil, 2018, art. 6º, I e III), segundo os quais cada pessoa deve acessar apenas o mínimo necessário à sua função.</w:t>
       </w:r>
     </w:p>
     <w:p>
@@ -1213,7 +1213,7 @@
           <w:i w:val="0"/>
           <w:sz w:val="24"/>
         </w:rPr>
-        <w:t>Para atender a esses princípios de forma verificável, adotou-se o sistema gerenciador de banco de dados relacional PostgreSQL, que oferece Row Level Security (RLS): políticas que restringem, na própria camada do banco, quais linhas de uma tabela cada usuário autenticado pode ler ou modificar (POSTGRESQL GLOBAL DEVELOPMENT GROUP, 2025). Com isso, a restrição de acesso de um docente às notas reservadas do profissional de saúde, por exemplo, é aplicada pelo banco independentemente da interface, o que impede que a informação seja obtida por chamada direta à interface de programação de aplicações (API).</w:t>
+        <w:t>Para atender a esses princípios de forma verificável, adotou-se o sistema gerenciador de banco de dados relacional PostgreSQL, que oferece Row Level Security (RLS): políticas que restringem, na própria camada do banco, quais linhas de uma tabela cada usuário autenticado pode ler ou modificar (PostgreSQL Global Development Group, 2025). Com isso, a restrição de acesso de um docente às notas reservadas do profissional de saúde, por exemplo, é aplicada pelo banco independentemente da interface, o que impede que a informação seja obtida por chamada direta à interface de programação de aplicações (API).</w:t>
       </w:r>
     </w:p>
     <w:p>
@@ -1245,7 +1245,7 @@
           <w:i w:val="0"/>
           <w:sz w:val="24"/>
         </w:rPr>
-        <w:t>A construção de sistemas de informação demanda escolhas arquiteturais que equilibrem manutenibilidade, desempenho, segurança e confiabilidade, características de qualidade definidas na norma ISO/IEC 25010 (INTERNATIONAL ORGANIZATION FOR STANDARDIZATION, 2023). Neste trabalho, adotou-se a linguagem TypeScript em todas as camadas, por sua tipagem estática, que permite detectar em tempo de compilação uma configuração inválida de parâmetros de adaptação. A interface foi construída com a biblioteca React e a ferramenta de build Vite. A camada de servidor usa a plataforma Supabase, que reúne PostgreSQL, autenticação com segundo fator (TOTP) e funções serverless (Edge Functions) executadas fora do navegador (SUPABASE, 2025).</w:t>
+        <w:t>A construção de sistemas de informação demanda escolhas arquiteturais que equilibrem manutenibilidade, desempenho, segurança e confiabilidade, características de qualidade definidas na norma ISO/IEC 25010 (International Organization for Standardization, 2023). Neste trabalho, adotou-se a linguagem TypeScript em todas as camadas, por sua tipagem estática, que permite detectar em tempo de compilação uma configuração inválida de parâmetros de adaptação. A interface foi construída com a biblioteca React e a ferramenta de build Vite. A camada de servidor usa a plataforma Supabase, que reúne PostgreSQL, autenticação com segundo fator (TOTP) e funções serverless (Edge Functions) executadas fora do navegador (Supabase, 2025).</w:t>
       </w:r>
     </w:p>
     <w:p>
@@ -1293,7 +1293,17 @@
           <w:i w:val="0"/>
           <w:sz w:val="24"/>
         </w:rPr>
-        <w:t>Três categorias de solução tecnológica relacionam-se ao problema investigado. A primeira é a plataforma brasileira Prova Adaptada (PROVA ADAPTADA, 2026), que utiliza inteligência artificial para adaptar provas e atividades a partir da categoria diagnóstica selecionada pelo docente (TEA, TDAH, dislexia, baixa visão ou discalculia). Como a adaptação é parametrizada pela categoria, e não por um perfil individual construído ao longo do tempo, dois estudantes com o mesmo laudo recebem tratamento equivalente.</w:t>
+        <w:t xml:space="preserve">Três categorias de solução tecnológica relacionam-se ao problema investigado. A primeira é a plataforma brasileira Prova Adaptada, hoje oferecida também sob o nome IncluiAI (Prova Adaptada, 2026), que utiliza inteligência artificial para gerar o PEI e adaptar atividades e provas elaboradas pelo docente. A adaptação é descrita em função das necessidades do aluno atípico, sem menção a um perfil individual atualizado ciclo a ciclo nem à validação por profissional de saúde. </w:t>
+      </w:r>
+      <w:r>
+        <w:rPr>
+          <w:rFonts w:ascii="Arial" w:hAnsi="Arial"/>
+          <w:b w:val="0"/>
+          <w:i w:val="0"/>
+          <w:sz w:val="24"/>
+          <w:highlight w:val="yellow"/>
+        </w:rPr>
+        <w:t>[CONFERIR: a versão anterior do artigo dizia que a adaptação era parametrizada pela categoria diagnóstica escolhida pelo docente (TEA, TDAH, dislexia, baixa visão ou discalculia); a página pública consultada em 13/10/2026 não cita as categorias. Confirmar dentro da plataforma ou retirar.]</w:t>
       </w:r>
     </w:p>
     <w:p>
@@ -1309,7 +1319,7 @@
           <w:i w:val="0"/>
           <w:sz w:val="24"/>
         </w:rPr>
-        <w:t>A segunda é a plataforma Vínculoo (VÍNCULOO, 2026), que digitaliza e centraliza os documentos do PEI, do Plano de Desenvolvimento Individual e do Plano de Atendimento Educacional Especializado, com preenchimento colaborativo entre escola e família. Trata-se de solução essencialmente documental: a informação registrada não gera material didático adaptado.</w:t>
+        <w:t>A segunda é a plataforma Vínculoo (Vínculoo, 2026), que organiza o PEI e o Plano de Atendimento Educacional Especializado em um padrão único, com participação da família no plano. Seu assistente de IA lê laudos, relatórios e observações importados, rascunha o plano e adapta a atividade da turma para cada estudante, e o professor faz o ajuste final. A diferença em relação ao PEI Vivo está na origem e no controle da adaptação: no Vínculoo, ela parte de documentos, inclusive laudos, e de um modelo de IA; no PEI Vivo, parte de observações periódicas, por regras determinísticas, sem armazenar laudo e com validação do profissional de saúde.</w:t>
       </w:r>
     </w:p>
     <w:p>
@@ -1325,7 +1335,7 @@
           <w:i w:val="0"/>
           <w:sz w:val="24"/>
         </w:rPr>
-        <w:t>No cenário internacional, as plataformas estadunidenses Frontline Education (FRONTLINE EDUCATION, 2026) e Goalbook Toolkit (GOALBOOK, 2026) apoiam a gestão do Individualized Education Program (IEP), equivalente ao PEI. Essas soluções priorizam a conformidade com a legislação norte-americana e o rastreamento de metas, sem gerar o material didático usado em sala nem integrar formalmente a rede de saúde.</w:t>
+        <w:t>No cenário internacional, as plataformas estadunidenses Frontline Education (Frontline Education, 2026) e Goalbook Toolkit (Goalbook, 2026) apoiam a elaboração e a gestão do Individualized Education Program (IEP), equivalente ao PEI. Essas soluções priorizam a conformidade com a legislação norte-americana, a escrita de metas e o acompanhamento do plano, sem gerar o material didático usado em sala nem integrar formalmente a rede de saúde.</w:t>
       </w:r>
     </w:p>
     <w:p>
@@ -1411,11 +1421,11 @@
         <w:tblLook w:firstColumn="1" w:firstRow="1" w:lastColumn="0" w:lastRow="0" w:noHBand="0" w:noVBand="1" w:val="04A0"/>
       </w:tblPr>
       <w:tblGrid>
-        <w:gridCol w:w="2496"/>
-        <w:gridCol w:w="1787"/>
-        <w:gridCol w:w="1181"/>
-        <w:gridCol w:w="1405"/>
-        <w:gridCol w:w="2199"/>
+        <w:gridCol w:w="2242"/>
+        <w:gridCol w:w="1168"/>
+        <w:gridCol w:w="2242"/>
+        <w:gridCol w:w="1262"/>
+        <w:gridCol w:w="2154"/>
       </w:tblGrid>
       <w:tr>
         <w:trPr>
@@ -1423,7 +1433,7 @@
         </w:trPr>
         <w:tc>
           <w:tcPr>
-            <w:tcW w:type="dxa" w:w="2496"/>
+            <w:tcW w:type="dxa" w:w="2242"/>
             <w:shd w:val="clear" w:fill="E7EDF2"/>
           </w:tcPr>
           <w:p>
@@ -1445,7 +1455,7 @@
         </w:tc>
         <w:tc>
           <w:tcPr>
-            <w:tcW w:type="dxa" w:w="1787"/>
+            <w:tcW w:type="dxa" w:w="1169"/>
             <w:shd w:val="clear" w:fill="E7EDF2"/>
           </w:tcPr>
           <w:p>
@@ -1467,7 +1477,7 @@
         </w:tc>
         <w:tc>
           <w:tcPr>
-            <w:tcW w:type="dxa" w:w="1182"/>
+            <w:tcW w:type="dxa" w:w="2242"/>
             <w:shd w:val="clear" w:fill="E7EDF2"/>
           </w:tcPr>
           <w:p>
@@ -1489,7 +1499,7 @@
         </w:tc>
         <w:tc>
           <w:tcPr>
-            <w:tcW w:type="dxa" w:w="1406"/>
+            <w:tcW w:type="dxa" w:w="1263"/>
             <w:shd w:val="clear" w:fill="E7EDF2"/>
           </w:tcPr>
           <w:p>
@@ -1511,7 +1521,7 @@
         </w:tc>
         <w:tc>
           <w:tcPr>
-            <w:tcW w:type="dxa" w:w="2200"/>
+            <w:tcW w:type="dxa" w:w="2154"/>
             <w:shd w:val="clear" w:fill="E7EDF2"/>
           </w:tcPr>
           <w:p>
@@ -1535,7 +1545,7 @@
       <w:tr>
         <w:tc>
           <w:tcPr>
-            <w:tcW w:type="dxa" w:w="2496"/>
+            <w:tcW w:type="dxa" w:w="2242"/>
           </w:tcPr>
           <w:p>
             <w:pPr>
@@ -1556,7 +1566,7 @@
         </w:tc>
         <w:tc>
           <w:tcPr>
-            <w:tcW w:type="dxa" w:w="1787"/>
+            <w:tcW w:type="dxa" w:w="1169"/>
           </w:tcPr>
           <w:p>
             <w:pPr>
@@ -1571,13 +1581,13 @@
                 <w:i w:val="0"/>
                 <w:sz w:val="20"/>
               </w:rPr>
-              <w:t>Não (categoria diagnóstica)</w:t>
+              <w:t>Não documentado</w:t>
             </w:r>
           </w:p>
         </w:tc>
         <w:tc>
           <w:tcPr>
-            <w:tcW w:type="dxa" w:w="1182"/>
+            <w:tcW w:type="dxa" w:w="2242"/>
           </w:tcPr>
           <w:p>
             <w:pPr>
@@ -1592,13 +1602,13 @@
                 <w:i w:val="0"/>
                 <w:sz w:val="20"/>
               </w:rPr>
-              <w:t>Não</w:t>
+              <w:t>Não documentado</w:t>
             </w:r>
           </w:p>
         </w:tc>
         <w:tc>
           <w:tcPr>
-            <w:tcW w:type="dxa" w:w="1406"/>
+            <w:tcW w:type="dxa" w:w="1263"/>
           </w:tcPr>
           <w:p>
             <w:pPr>
@@ -1619,7 +1629,7 @@
         </w:tc>
         <w:tc>
           <w:tcPr>
-            <w:tcW w:type="dxa" w:w="2200"/>
+            <w:tcW w:type="dxa" w:w="2154"/>
           </w:tcPr>
           <w:p>
             <w:pPr>
@@ -1642,7 +1652,7 @@
       <w:tr>
         <w:tc>
           <w:tcPr>
-            <w:tcW w:type="dxa" w:w="2496"/>
+            <w:tcW w:type="dxa" w:w="2242"/>
           </w:tcPr>
           <w:p>
             <w:pPr>
@@ -1662,7 +1672,7 @@
         </w:tc>
         <w:tc>
           <w:tcPr>
-            <w:tcW w:type="dxa" w:w="1787"/>
+            <w:tcW w:type="dxa" w:w="1169"/>
           </w:tcPr>
           <w:p>
             <w:pPr>
@@ -1682,7 +1692,7 @@
         </w:tc>
         <w:tc>
           <w:tcPr>
-            <w:tcW w:type="dxa" w:w="1182"/>
+            <w:tcW w:type="dxa" w:w="2242"/>
           </w:tcPr>
           <w:p>
             <w:pPr>
@@ -1702,7 +1712,7 @@
         </w:tc>
         <w:tc>
           <w:tcPr>
-            <w:tcW w:type="dxa" w:w="1406"/>
+            <w:tcW w:type="dxa" w:w="1263"/>
           </w:tcPr>
           <w:p>
             <w:pPr>
@@ -1722,7 +1732,7 @@
         </w:tc>
         <w:tc>
           <w:tcPr>
-            <w:tcW w:type="dxa" w:w="2200"/>
+            <w:tcW w:type="dxa" w:w="2154"/>
           </w:tcPr>
           <w:p>
             <w:pPr>
@@ -1744,7 +1754,7 @@
       <w:tr>
         <w:tc>
           <w:tcPr>
-            <w:tcW w:type="dxa" w:w="2496"/>
+            <w:tcW w:type="dxa" w:w="2242"/>
           </w:tcPr>
           <w:p>
             <w:pPr>
@@ -1764,7 +1774,7 @@
         </w:tc>
         <w:tc>
           <w:tcPr>
-            <w:tcW w:type="dxa" w:w="1787"/>
+            <w:tcW w:type="dxa" w:w="1169"/>
           </w:tcPr>
           <w:p>
             <w:pPr>
@@ -1784,7 +1794,27 @@
         </w:tc>
         <w:tc>
           <w:tcPr>
-            <w:tcW w:type="dxa" w:w="1182"/>
+            <w:tcW w:type="dxa" w:w="2242"/>
+          </w:tcPr>
+          <w:p>
+            <w:pPr>
+              <w:spacing w:line="240" w:lineRule="auto" w:before="0" w:after="0"/>
+            </w:pPr>
+            <w:r/>
+            <w:r>
+              <w:rPr>
+                <w:rFonts w:ascii="Arial" w:hAnsi="Arial"/>
+                <w:b w:val="0"/>
+                <w:i w:val="0"/>
+                <w:sz w:val="20"/>
+              </w:rPr>
+              <w:t>Sim (IA, a partir de documentos e laudos)</w:t>
+            </w:r>
+          </w:p>
+        </w:tc>
+        <w:tc>
+          <w:tcPr>
+            <w:tcW w:type="dxa" w:w="1263"/>
           </w:tcPr>
           <w:p>
             <w:pPr>
@@ -1804,7 +1834,49 @@
         </w:tc>
         <w:tc>
           <w:tcPr>
-            <w:tcW w:type="dxa" w:w="1406"/>
+            <w:tcW w:type="dxa" w:w="2154"/>
+          </w:tcPr>
+          <w:p>
+            <w:pPr>
+              <w:spacing w:line="240" w:lineRule="auto" w:before="0" w:after="0"/>
+            </w:pPr>
+            <w:r/>
+            <w:r>
+              <w:rPr>
+                <w:rFonts w:ascii="Arial" w:hAnsi="Arial"/>
+                <w:b w:val="0"/>
+                <w:i w:val="0"/>
+                <w:sz w:val="20"/>
+              </w:rPr>
+              <w:t>Sim (regras determinísticas, sem laudo)</w:t>
+            </w:r>
+          </w:p>
+        </w:tc>
+      </w:tr>
+      <w:tr>
+        <w:tc>
+          <w:tcPr>
+            <w:tcW w:type="dxa" w:w="2242"/>
+          </w:tcPr>
+          <w:p>
+            <w:pPr>
+              <w:spacing w:line="240" w:lineRule="auto" w:before="0" w:after="0"/>
+            </w:pPr>
+            <w:r/>
+            <w:r>
+              <w:rPr>
+                <w:rFonts w:ascii="Arial" w:hAnsi="Arial"/>
+                <w:b w:val="0"/>
+                <w:i w:val="0"/>
+                <w:sz w:val="20"/>
+              </w:rPr>
+              <w:t>Funciona sem IA</w:t>
+            </w:r>
+          </w:p>
+        </w:tc>
+        <w:tc>
+          <w:tcPr>
+            <w:tcW w:type="dxa" w:w="1169"/>
           </w:tcPr>
           <w:p>
             <w:pPr>
@@ -1824,7 +1896,7 @@
         </w:tc>
         <w:tc>
           <w:tcPr>
-            <w:tcW w:type="dxa" w:w="2200"/>
+            <w:tcW w:type="dxa" w:w="2242"/>
           </w:tcPr>
           <w:p>
             <w:pPr>
@@ -1838,55 +1910,13 @@
                 <w:i w:val="0"/>
                 <w:sz w:val="20"/>
               </w:rPr>
-              <w:t>Sim (regras determinísticas)</w:t>
-            </w:r>
-          </w:p>
-        </w:tc>
-      </w:tr>
-      <w:tr>
-        <w:tc>
-          <w:tcPr>
-            <w:tcW w:type="dxa" w:w="2496"/>
-          </w:tcPr>
-          <w:p>
-            <w:pPr>
-              <w:spacing w:line="240" w:lineRule="auto" w:before="0" w:after="0"/>
-            </w:pPr>
-            <w:r/>
-            <w:r>
-              <w:rPr>
-                <w:rFonts w:ascii="Arial" w:hAnsi="Arial"/>
-                <w:b w:val="0"/>
-                <w:i w:val="0"/>
-                <w:sz w:val="20"/>
-              </w:rPr>
-              <w:t>Funciona sem IA</w:t>
+              <w:t>Não documentado</w:t>
             </w:r>
           </w:p>
         </w:tc>
         <w:tc>
           <w:tcPr>
-            <w:tcW w:type="dxa" w:w="1787"/>
-          </w:tcPr>
-          <w:p>
-            <w:pPr>
-              <w:spacing w:line="240" w:lineRule="auto" w:before="0" w:after="0"/>
-            </w:pPr>
-            <w:r/>
-            <w:r>
-              <w:rPr>
-                <w:rFonts w:ascii="Arial" w:hAnsi="Arial"/>
-                <w:b w:val="0"/>
-                <w:i w:val="0"/>
-                <w:sz w:val="20"/>
-              </w:rPr>
-              <w:t>Não</w:t>
-            </w:r>
-          </w:p>
-        </w:tc>
-        <w:tc>
-          <w:tcPr>
-            <w:tcW w:type="dxa" w:w="1182"/>
+            <w:tcW w:type="dxa" w:w="1263"/>
           </w:tcPr>
           <w:p>
             <w:pPr>
@@ -1906,27 +1936,7 @@
         </w:tc>
         <w:tc>
           <w:tcPr>
-            <w:tcW w:type="dxa" w:w="1406"/>
-          </w:tcPr>
-          <w:p>
-            <w:pPr>
-              <w:spacing w:line="240" w:lineRule="auto" w:before="0" w:after="0"/>
-            </w:pPr>
-            <w:r/>
-            <w:r>
-              <w:rPr>
-                <w:rFonts w:ascii="Arial" w:hAnsi="Arial"/>
-                <w:b w:val="0"/>
-                <w:i w:val="0"/>
-                <w:sz w:val="20"/>
-              </w:rPr>
-              <w:t>Não se aplica</w:t>
-            </w:r>
-          </w:p>
-        </w:tc>
-        <w:tc>
-          <w:tcPr>
-            <w:tcW w:type="dxa" w:w="2200"/>
+            <w:tcW w:type="dxa" w:w="2154"/>
           </w:tcPr>
           <w:p>
             <w:pPr>
@@ -1948,7 +1958,7 @@
       <w:tr>
         <w:tc>
           <w:tcPr>
-            <w:tcW w:type="dxa" w:w="2496"/>
+            <w:tcW w:type="dxa" w:w="2242"/>
           </w:tcPr>
           <w:p>
             <w:pPr>
@@ -1968,7 +1978,7 @@
         </w:tc>
         <w:tc>
           <w:tcPr>
-            <w:tcW w:type="dxa" w:w="1787"/>
+            <w:tcW w:type="dxa" w:w="1169"/>
           </w:tcPr>
           <w:p>
             <w:pPr>
@@ -1988,7 +1998,7 @@
         </w:tc>
         <w:tc>
           <w:tcPr>
-            <w:tcW w:type="dxa" w:w="1182"/>
+            <w:tcW w:type="dxa" w:w="2242"/>
           </w:tcPr>
           <w:p>
             <w:pPr>
@@ -2008,7 +2018,7 @@
         </w:tc>
         <w:tc>
           <w:tcPr>
-            <w:tcW w:type="dxa" w:w="1406"/>
+            <w:tcW w:type="dxa" w:w="1263"/>
           </w:tcPr>
           <w:p>
             <w:pPr>
@@ -2028,7 +2038,7 @@
         </w:tc>
         <w:tc>
           <w:tcPr>
-            <w:tcW w:type="dxa" w:w="2200"/>
+            <w:tcW w:type="dxa" w:w="2154"/>
           </w:tcPr>
           <w:p>
             <w:pPr>
@@ -2050,7 +2060,7 @@
       <w:tr>
         <w:tc>
           <w:tcPr>
-            <w:tcW w:type="dxa" w:w="2496"/>
+            <w:tcW w:type="dxa" w:w="2242"/>
           </w:tcPr>
           <w:p>
             <w:pPr>
@@ -2070,7 +2080,7 @@
         </w:tc>
         <w:tc>
           <w:tcPr>
-            <w:tcW w:type="dxa" w:w="1787"/>
+            <w:tcW w:type="dxa" w:w="1169"/>
           </w:tcPr>
           <w:p>
             <w:pPr>
@@ -2090,7 +2100,7 @@
         </w:tc>
         <w:tc>
           <w:tcPr>
-            <w:tcW w:type="dxa" w:w="1182"/>
+            <w:tcW w:type="dxa" w:w="2242"/>
           </w:tcPr>
           <w:p>
             <w:pPr>
@@ -2110,7 +2120,7 @@
         </w:tc>
         <w:tc>
           <w:tcPr>
-            <w:tcW w:type="dxa" w:w="1406"/>
+            <w:tcW w:type="dxa" w:w="1263"/>
           </w:tcPr>
           <w:p>
             <w:pPr>
@@ -2130,7 +2140,7 @@
         </w:tc>
         <w:tc>
           <w:tcPr>
-            <w:tcW w:type="dxa" w:w="2200"/>
+            <w:tcW w:type="dxa" w:w="2154"/>
           </w:tcPr>
           <w:p>
             <w:pPr>
@@ -2210,7 +2220,7 @@
           <w:i w:val="0"/>
           <w:sz w:val="24"/>
         </w:rPr>
-        <w:t>Quanto à natureza, esta pesquisa classifica-se como aplicada, por ter como finalidade a geração de conhecimento dirigido à solução de um problema específico (PRODANOV; FREITAS, 2013). Quanto aos objetivos, é exploratória e descritiva. Quanto aos procedimentos, segue a Design Science Research (HEVNER et al., 2004; DRESCH; LACERDA; ANTUNES JÚNIOR, 2015), abordagem que orienta a construção de um artefato para resolver um problema relevante e a sua avaliação com critérios definidos previamente. O artefato é o PEI Vivo; a avaliação combina verificação técnica automatizada (seção 3.4) e avaliação de usabilidade com usuários (seção 4.5). Não houve experimento controlado.</w:t>
+        <w:t>Quanto à natureza, esta pesquisa classifica-se como aplicada, por ter como finalidade a geração de conhecimento dirigido à solução de um problema específico (Prodanov; Freitas, 2013). Quanto aos objetivos, é exploratória e descritiva. Quanto aos procedimentos, segue a Design Science Research (Hevner et al., 2004; Dresch; Lacerda; Antunes Júnior, 2015), abordagem que orienta a construção de um artefato para resolver um problema relevante e a sua avaliação com critérios definidos previamente. O artefato é o PEI Vivo; a avaliação combina verificação técnica automatizada (seção 3.4) e avaliação de usabilidade com usuários (seção 4.5). Não houve experimento controlado.</w:t>
       </w:r>
     </w:p>
     <w:p>
@@ -2296,7 +2306,7 @@
           <w:i w:val="0"/>
           <w:sz w:val="24"/>
         </w:rPr>
-        <w:t xml:space="preserve"> A pesquisa de opinião com participantes não identificados está dispensada de registro no sistema CEP/Conep (BRASIL, 2016, art. 1º, parágrafo único, I) </w:t>
+        <w:t xml:space="preserve"> A pesquisa de opinião com participantes não identificados está dispensada de registro no sistema CEP/Conep (Brasil, 2016, art. 1º, parágrafo único, I) </w:t>
       </w:r>
       <w:r>
         <w:rPr>
@@ -4678,7 +4688,7 @@
           <w:i w:val="0"/>
           <w:sz w:val="24"/>
         </w:rPr>
-        <w:t>3.2.4 Diagrama 1: Diagrama de Classes</w:t>
+        <w:t>3.2.4 Diagrama de classes</w:t>
       </w:r>
     </w:p>
     <w:p>
@@ -4740,7 +4750,13 @@
                     <pic:cNvPicPr/>
                   </pic:nvPicPr>
                   <pic:blipFill>
-                    <a:blip r:embed="rId10"/>
+                    <a:blip r:embed="rId10">
+                      <a:extLst>
+                        <a:ext uri="{96DAC541-7B7A-43D3-8B79-37D633B846F1}">
+                          <asvg:svgBlip xmlns:asvg="http://schemas.microsoft.com/office/drawing/2016/SVG/main" r:embed="rId11"/>
+                        </a:ext>
+                      </a:extLst>
+                    </a:blip>
                     <a:stretch>
                       <a:fillRect/>
                     </a:stretch>
@@ -4787,7 +4803,7 @@
           <w:i w:val="0"/>
           <w:sz w:val="24"/>
         </w:rPr>
-        <w:t>3.2.5 Diagrama 2: Diagrama de Casos de Uso</w:t>
+        <w:t>3.2.5 Diagrama de casos de uso</w:t>
       </w:r>
     </w:p>
     <w:p>
@@ -4855,7 +4871,13 @@
                     <pic:cNvPicPr/>
                   </pic:nvPicPr>
                   <pic:blipFill>
-                    <a:blip r:embed="rId11"/>
+                    <a:blip r:embed="rId12">
+                      <a:extLst>
+                        <a:ext uri="{96DAC541-7B7A-43D3-8B79-37D633B846F1}">
+                          <asvg:svgBlip xmlns:asvg="http://schemas.microsoft.com/office/drawing/2016/SVG/main" r:embed="rId13"/>
+                        </a:ext>
+                      </a:extLst>
+                    </a:blip>
                     <a:stretch>
                       <a:fillRect/>
                     </a:stretch>
@@ -4912,7 +4934,7 @@
           <w:i w:val="0"/>
           <w:sz w:val="24"/>
         </w:rPr>
-        <w:t>3.2.6 Diagrama 3: Diagrama de Sequência</w:t>
+        <w:t>3.2.6 Diagrama de sequência</w:t>
       </w:r>
     </w:p>
     <w:p>
@@ -4974,7 +4996,13 @@
                     <pic:cNvPicPr/>
                   </pic:nvPicPr>
                   <pic:blipFill>
-                    <a:blip r:embed="rId12"/>
+                    <a:blip r:embed="rId14">
+                      <a:extLst>
+                        <a:ext uri="{96DAC541-7B7A-43D3-8B79-37D633B846F1}">
+                          <asvg:svgBlip xmlns:asvg="http://schemas.microsoft.com/office/drawing/2016/SVG/main" r:embed="rId15"/>
+                        </a:ext>
+                      </a:extLst>
+                    </a:blip>
                     <a:stretch>
                       <a:fillRect/>
                     </a:stretch>
@@ -7596,15 +7624,39 @@
           <w:i w:val="0"/>
           <w:sz w:val="24"/>
         </w:rPr>
-        <w:t>O protótipo usa um cenário demonstrativo fictício, sem dados reais de estudante: um estudante de nove anos, do 4º ano, com interesse manifesto por dinossauros, cujo perfil de aprendizagem foi construído por docente, responsável e profissional de saúde fictícios. A Figura 4 reproduz o trecho do motor determinístico que aplica a assimetria conservadora da RN03 ao nível de vocabulário; a mesma regra vale para os demais parâmetros (D-42).</w:t>
+        <w:t>O protótipo usa um cenário demonstrativo fictício, sem dados reais de estudante: um estudante de nove anos, do 4º ano, com interesse manifesto por dinossauros, cujo perfil de aprendizagem foi construído por docente, responsável e profissional de saúde fictícios. O Código 1 reproduz o trecho do motor determinístico que aplica a assimetria conservadora da RN03 ao nível de vocabulário; a mesma regra vale para os demais parâmetros (D-42).</w:t>
       </w:r>
     </w:p>
     <w:p>
       <w:pPr>
         <w:keepNext/>
-        <w:spacing w:line="240" w:lineRule="auto" w:before="120" w:after="0"/>
+        <w:spacing w:line="240" w:lineRule="auto" w:before="120" w:after="60"/>
+        <w:jc w:val="center"/>
+      </w:pPr>
+      <w:r>
+        <w:rPr>
+          <w:rFonts w:ascii="Arial" w:hAnsi="Arial"/>
+          <w:b/>
+          <w:i w:val="0"/>
+          <w:sz w:val="20"/>
+        </w:rPr>
+        <w:t>Código 1 – Trecho do motor de adaptação determinístico (TypeScript)</w:t>
+      </w:r>
+    </w:p>
+    <w:p>
+      <w:pPr>
+        <w:keepNext/>
+        <w:spacing w:line="240" w:lineRule="auto" w:before="60" w:after="0"/>
         <w:ind w:left="567"/>
       </w:pPr>
+      <w:r>
+        <w:rPr>
+          <w:rFonts w:ascii="Consolas" w:hAnsi="Consolas"/>
+          <w:color w:val="6B6B6B"/>
+          <w:sz w:val="18"/>
+        </w:rPr>
+        <w:t xml:space="preserve"> 1  </w:t>
+      </w:r>
       <w:r>
         <w:rPr>
           <w:rFonts w:ascii="Consolas" w:hAnsi="Consolas"/>
@@ -7624,6 +7676,14 @@
       <w:r>
         <w:rPr>
           <w:rFonts w:ascii="Consolas" w:hAnsi="Consolas"/>
+          <w:color w:val="6B6B6B"/>
+          <w:sz w:val="18"/>
+        </w:rPr>
+        <w:t xml:space="preserve"> 2  </w:t>
+      </w:r>
+      <w:r>
+        <w:rPr>
+          <w:rFonts w:ascii="Consolas" w:hAnsi="Consolas"/>
           <w:b w:val="0"/>
           <w:i w:val="0"/>
           <w:sz w:val="18"/>
@@ -7637,6 +7697,14 @@
         <w:spacing w:line="240" w:lineRule="auto" w:before="0" w:after="0"/>
         <w:ind w:left="567"/>
       </w:pPr>
+      <w:r>
+        <w:rPr>
+          <w:rFonts w:ascii="Consolas" w:hAnsi="Consolas"/>
+          <w:color w:val="6B6B6B"/>
+          <w:sz w:val="18"/>
+        </w:rPr>
+        <w:t xml:space="preserve"> 3  </w:t>
+      </w:r>
       <w:r>
         <w:rPr>
           <w:rFonts w:ascii="Consolas" w:hAnsi="Consolas"/>
@@ -7656,6 +7724,14 @@
       <w:r>
         <w:rPr>
           <w:rFonts w:ascii="Consolas" w:hAnsi="Consolas"/>
+          <w:color w:val="6B6B6B"/>
+          <w:sz w:val="18"/>
+        </w:rPr>
+        <w:t xml:space="preserve"> 4  </w:t>
+      </w:r>
+      <w:r>
+        <w:rPr>
+          <w:rFonts w:ascii="Consolas" w:hAnsi="Consolas"/>
           <w:b w:val="0"/>
           <w:i w:val="0"/>
           <w:sz w:val="18"/>
@@ -7669,6 +7745,14 @@
         <w:spacing w:line="240" w:lineRule="auto" w:before="0" w:after="0"/>
         <w:ind w:left="567"/>
       </w:pPr>
+      <w:r>
+        <w:rPr>
+          <w:rFonts w:ascii="Consolas" w:hAnsi="Consolas"/>
+          <w:color w:val="6B6B6B"/>
+          <w:sz w:val="18"/>
+        </w:rPr>
+        <w:t xml:space="preserve"> 5  </w:t>
+      </w:r>
       <w:r>
         <w:rPr>
           <w:rFonts w:ascii="Consolas" w:hAnsi="Consolas"/>
@@ -7688,6 +7772,14 @@
       <w:r>
         <w:rPr>
           <w:rFonts w:ascii="Consolas" w:hAnsi="Consolas"/>
+          <w:color w:val="6B6B6B"/>
+          <w:sz w:val="18"/>
+        </w:rPr>
+        <w:t xml:space="preserve"> 6  </w:t>
+      </w:r>
+      <w:r>
+        <w:rPr>
+          <w:rFonts w:ascii="Consolas" w:hAnsi="Consolas"/>
           <w:b w:val="0"/>
           <w:i w:val="0"/>
           <w:sz w:val="18"/>
@@ -7701,6 +7793,14 @@
         <w:spacing w:line="240" w:lineRule="auto" w:before="0" w:after="0"/>
         <w:ind w:left="567"/>
       </w:pPr>
+      <w:r>
+        <w:rPr>
+          <w:rFonts w:ascii="Consolas" w:hAnsi="Consolas"/>
+          <w:color w:val="6B6B6B"/>
+          <w:sz w:val="18"/>
+        </w:rPr>
+        <w:t xml:space="preserve"> 7  </w:t>
+      </w:r>
       <w:r>
         <w:rPr>
           <w:rFonts w:ascii="Consolas" w:hAnsi="Consolas"/>
@@ -7720,6 +7820,14 @@
       <w:r>
         <w:rPr>
           <w:rFonts w:ascii="Consolas" w:hAnsi="Consolas"/>
+          <w:color w:val="6B6B6B"/>
+          <w:sz w:val="18"/>
+        </w:rPr>
+        <w:t xml:space="preserve"> 8  </w:t>
+      </w:r>
+      <w:r>
+        <w:rPr>
+          <w:rFonts w:ascii="Consolas" w:hAnsi="Consolas"/>
           <w:b w:val="0"/>
           <w:i w:val="0"/>
           <w:sz w:val="18"/>
@@ -7733,6 +7841,14 @@
         <w:spacing w:line="240" w:lineRule="auto" w:before="0" w:after="0"/>
         <w:ind w:left="567"/>
       </w:pPr>
+      <w:r>
+        <w:rPr>
+          <w:rFonts w:ascii="Consolas" w:hAnsi="Consolas"/>
+          <w:color w:val="6B6B6B"/>
+          <w:sz w:val="18"/>
+        </w:rPr>
+        <w:t xml:space="preserve"> 9  </w:t>
+      </w:r>
       <w:r>
         <w:rPr>
           <w:rFonts w:ascii="Consolas" w:hAnsi="Consolas"/>
@@ -7752,6 +7868,14 @@
       <w:r>
         <w:rPr>
           <w:rFonts w:ascii="Consolas" w:hAnsi="Consolas"/>
+          <w:color w:val="6B6B6B"/>
+          <w:sz w:val="18"/>
+        </w:rPr>
+        <w:t xml:space="preserve">10  </w:t>
+      </w:r>
+      <w:r>
+        <w:rPr>
+          <w:rFonts w:ascii="Consolas" w:hAnsi="Consolas"/>
           <w:b w:val="0"/>
           <w:i w:val="0"/>
           <w:sz w:val="18"/>
@@ -7765,6 +7889,14 @@
         <w:spacing w:line="240" w:lineRule="auto" w:before="0" w:after="0"/>
         <w:ind w:left="567"/>
       </w:pPr>
+      <w:r>
+        <w:rPr>
+          <w:rFonts w:ascii="Consolas" w:hAnsi="Consolas"/>
+          <w:color w:val="6B6B6B"/>
+          <w:sz w:val="18"/>
+        </w:rPr>
+        <w:t xml:space="preserve">11  </w:t>
+      </w:r>
       <w:r>
         <w:rPr>
           <w:rFonts w:ascii="Consolas" w:hAnsi="Consolas"/>
@@ -7784,6 +7916,14 @@
       <w:r>
         <w:rPr>
           <w:rFonts w:ascii="Consolas" w:hAnsi="Consolas"/>
+          <w:color w:val="6B6B6B"/>
+          <w:sz w:val="18"/>
+        </w:rPr>
+        <w:t xml:space="preserve">12  </w:t>
+      </w:r>
+      <w:r>
+        <w:rPr>
+          <w:rFonts w:ascii="Consolas" w:hAnsi="Consolas"/>
           <w:b w:val="0"/>
           <w:i w:val="0"/>
           <w:sz w:val="18"/>
@@ -7797,6 +7937,14 @@
         <w:spacing w:line="240" w:lineRule="auto" w:before="0" w:after="0"/>
         <w:ind w:left="567"/>
       </w:pPr>
+      <w:r>
+        <w:rPr>
+          <w:rFonts w:ascii="Consolas" w:hAnsi="Consolas"/>
+          <w:color w:val="6B6B6B"/>
+          <w:sz w:val="18"/>
+        </w:rPr>
+        <w:t xml:space="preserve">13  </w:t>
+      </w:r>
       <w:r>
         <w:rPr>
           <w:rFonts w:ascii="Consolas" w:hAnsi="Consolas"/>
@@ -7816,6 +7964,14 @@
       <w:r>
         <w:rPr>
           <w:rFonts w:ascii="Consolas" w:hAnsi="Consolas"/>
+          <w:color w:val="6B6B6B"/>
+          <w:sz w:val="18"/>
+        </w:rPr>
+        <w:t xml:space="preserve">14  </w:t>
+      </w:r>
+      <w:r>
+        <w:rPr>
+          <w:rFonts w:ascii="Consolas" w:hAnsi="Consolas"/>
           <w:b w:val="0"/>
           <w:i w:val="0"/>
           <w:sz w:val="18"/>
@@ -7825,10 +7981,18 @@
     </w:p>
     <w:p>
       <w:pPr>
-        <w:keepNext/>
+        <w:keepNext w:val="0"/>
         <w:spacing w:line="240" w:lineRule="auto" w:before="0" w:after="0"/>
         <w:ind w:left="567"/>
       </w:pPr>
+      <w:r>
+        <w:rPr>
+          <w:rFonts w:ascii="Consolas" w:hAnsi="Consolas"/>
+          <w:color w:val="6B6B6B"/>
+          <w:sz w:val="18"/>
+        </w:rPr>
+        <w:t xml:space="preserve">15  </w:t>
+      </w:r>
       <w:r>
         <w:rPr>
           <w:rFonts w:ascii="Consolas" w:hAnsi="Consolas"/>
@@ -7841,22 +8005,6 @@
     </w:p>
     <w:p>
       <w:pPr>
-        <w:keepNext/>
-        <w:spacing w:line="240" w:lineRule="auto" w:before="120" w:after="60"/>
-        <w:jc w:val="center"/>
-      </w:pPr>
-      <w:r>
-        <w:rPr>
-          <w:rFonts w:ascii="Arial" w:hAnsi="Arial"/>
-          <w:b/>
-          <w:i w:val="0"/>
-          <w:sz w:val="20"/>
-        </w:rPr>
-        <w:t>Figura 4 – Trecho do motor de adaptação determinístico (TypeScript)</w:t>
-      </w:r>
-    </w:p>
-    <w:p>
-      <w:pPr>
         <w:spacing w:line="240" w:lineRule="auto" w:before="60" w:after="180"/>
         <w:jc w:val="center"/>
       </w:pPr>
@@ -7931,7 +8079,7 @@
           <w:i w:val="0"/>
           <w:sz w:val="24"/>
         </w:rPr>
-        <w:t xml:space="preserve">O segundo é a avaliação de usabilidade com usuários, em sessão individual de cerca de 20 minutos sobre o protótipo com dados fictícios. Cada participante lê o TCLE, executa três tarefas do seu perfil (por exemplo, o docente registra uma observação, gera e aprova um material; o responsável verifica quem tem acesso aos dados e revoga o consentimento) e responde ao questionário SUS (BROOKE, 1996). São registrados o tempo de cada tarefa, a conclusão com ou sem ajuda e os problemas observados. O formulário não coleta nome nem e-mail. </w:t>
+        <w:t xml:space="preserve">O segundo é a avaliação de usabilidade com usuários, em sessão individual de cerca de 20 minutos sobre o protótipo com dados fictícios. Cada participante lê o TCLE, executa três tarefas do seu perfil (por exemplo, o docente registra uma observação, gera e aprova um material; o responsável verifica quem tem acesso aos dados e revoga o consentimento) e responde ao questionário SUS (Brooke, 1996). São registrados o tempo de cada tarefa, a conclusão com ou sem ajuda e os problemas observados. O formulário não coleta nome nem e-mail. </w:t>
       </w:r>
       <w:r>
         <w:rPr>
@@ -8038,7 +8186,7 @@
           <w:i w:val="0"/>
           <w:sz w:val="24"/>
         </w:rPr>
-        <w:t>As Figuras 5 a 11 percorrem um ciclo completo com os dados fictícios do protótipo.</w:t>
+        <w:t>As Figuras 4 a 10 percorrem um ciclo completo com os dados fictícios do protótipo.</w:t>
       </w:r>
     </w:p>
     <w:p>
@@ -8070,7 +8218,7 @@
           <w:i w:val="0"/>
           <w:sz w:val="24"/>
         </w:rPr>
-        <w:t>Na tela de observação (Figura 5), o docente registra, para cada uma das seis dimensões, se o comportamento ficou reduzido, estável ou ampliado em relação ao ciclo anterior, com evidência opcional em texto livre. A mesma tela atende responsável e profissional de saúde, com rótulos adaptados a cada um. Em teste automatizado em navegador, o registro das seis dimensões levou cerca de 1 segundo de máquina; o tempo humano será medido na avaliação com usuários.</w:t>
+        <w:t>Na tela de observação (Figura 4), o docente registra, para cada uma das seis dimensões, se o comportamento ficou reduzido, estável ou ampliado em relação ao ciclo anterior, com evidência opcional em texto livre. A mesma tela atende responsável e profissional de saúde, com rótulos adaptados a cada um. Em teste automatizado em navegador, o registro das seis dimensões levou cerca de 1 segundo de máquina; o tempo humano será medido na avaliação com usuários.</w:t>
       </w:r>
     </w:p>
     <w:p>
@@ -8086,7 +8234,7 @@
           <w:i w:val="0"/>
           <w:sz w:val="20"/>
         </w:rPr>
-        <w:t>Figura 5 – Registro de observação pelo docente</w:t>
+        <w:t>Figura 4 – Registro de observação pelo docente</w:t>
       </w:r>
     </w:p>
     <w:p>
@@ -8108,318 +8256,6 @@
                 <pic:pic>
                   <pic:nvPicPr>
                     <pic:cNvPr id="0" name="01-observar.png"/>
-                    <pic:cNvPicPr/>
-                  </pic:nvPicPr>
-                  <pic:blipFill>
-                    <a:blip r:embed="rId13"/>
-                    <a:stretch>
-                      <a:fillRect/>
-                    </a:stretch>
-                  </pic:blipFill>
-                  <pic:spPr>
-                    <a:xfrm>
-                      <a:off x="0" y="0"/>
-                      <a:ext cx="5760000" cy="3600000"/>
-                    </a:xfrm>
-                    <a:prstGeom prst="rect"/>
-                  </pic:spPr>
-                </pic:pic>
-              </a:graphicData>
-            </a:graphic>
-          </wp:inline>
-        </w:drawing>
-      </w:r>
-    </w:p>
-    <w:p>
-      <w:pPr>
-        <w:spacing w:line="240" w:lineRule="auto" w:before="60" w:after="180"/>
-        <w:jc w:val="center"/>
-      </w:pPr>
-      <w:r>
-        <w:rPr>
-          <w:rFonts w:ascii="Arial" w:hAnsi="Arial"/>
-          <w:b w:val="0"/>
-          <w:i w:val="0"/>
-          <w:sz w:val="20"/>
-        </w:rPr>
-        <w:t>Fonte: Autoria própria (2026).</w:t>
-      </w:r>
-    </w:p>
-    <w:p>
-      <w:pPr>
-        <w:keepNext/>
-        <w:spacing w:line="360" w:lineRule="auto" w:before="120" w:after="60"/>
-        <w:jc w:val="left"/>
-      </w:pPr>
-      <w:r>
-        <w:rPr>
-          <w:rFonts w:ascii="Arial" w:hAnsi="Arial"/>
-          <w:b w:val="0"/>
-          <w:i w:val="0"/>
-          <w:sz w:val="24"/>
-        </w:rPr>
-        <w:t>4.2.2 Tela de fechamento de ciclo</w:t>
-      </w:r>
-    </w:p>
-    <w:p>
-      <w:pPr>
-        <w:spacing w:line="360" w:lineRule="auto" w:before="0" w:after="0"/>
-        <w:ind w:firstLine="709"/>
-        <w:jc w:val="both"/>
-      </w:pPr>
-      <w:r>
-        <w:rPr>
-          <w:rFonts w:ascii="Arial" w:hAnsi="Arial"/>
-          <w:b w:val="0"/>
-          <w:i w:val="0"/>
-          <w:sz w:val="24"/>
-        </w:rPr>
-        <w:t>Ao fechar o ciclo (Figura 6), o docente vê a proposta de parâmetros calculada pelo motor, comparada com a versão vigente. No exemplo, o cansaço ampliado relatado pela família reduz de imediato o número de blocos por material, enquanto a melhora na autonomia com palavras aguarda um segundo ciclo para elevar o vocabulário, conforme a RN03.</w:t>
-      </w:r>
-    </w:p>
-    <w:p>
-      <w:pPr>
-        <w:keepNext/>
-        <w:spacing w:line="240" w:lineRule="auto" w:before="120" w:after="60"/>
-        <w:jc w:val="center"/>
-      </w:pPr>
-      <w:r>
-        <w:rPr>
-          <w:rFonts w:ascii="Arial" w:hAnsi="Arial"/>
-          <w:b/>
-          <w:i w:val="0"/>
-          <w:sz w:val="20"/>
-        </w:rPr>
-        <w:t>Figura 6 – Fechamento de ciclo com a proposta de parâmetros</w:t>
-      </w:r>
-    </w:p>
-    <w:p>
-      <w:pPr>
-        <w:keepNext/>
-        <w:spacing w:line="240" w:lineRule="auto" w:before="0" w:after="0"/>
-        <w:jc w:val="center"/>
-      </w:pPr>
-      <w:r>
-        <w:drawing>
-          <wp:inline xmlns:a="http://schemas.openxmlformats.org/drawingml/2006/main" xmlns:pic="http://schemas.openxmlformats.org/drawingml/2006/picture">
-            <wp:extent cx="5760000" cy="3600000"/>
-            <wp:docPr id="5" name="Picture 5"/>
-            <wp:cNvGraphicFramePr>
-              <a:graphicFrameLocks noChangeAspect="1"/>
-            </wp:cNvGraphicFramePr>
-            <a:graphic>
-              <a:graphicData uri="http://schemas.openxmlformats.org/drawingml/2006/picture">
-                <pic:pic>
-                  <pic:nvPicPr>
-                    <pic:cNvPr id="0" name="02-fechar-ciclo.png"/>
-                    <pic:cNvPicPr/>
-                  </pic:nvPicPr>
-                  <pic:blipFill>
-                    <a:blip r:embed="rId14"/>
-                    <a:stretch>
-                      <a:fillRect/>
-                    </a:stretch>
-                  </pic:blipFill>
-                  <pic:spPr>
-                    <a:xfrm>
-                      <a:off x="0" y="0"/>
-                      <a:ext cx="5760000" cy="3600000"/>
-                    </a:xfrm>
-                    <a:prstGeom prst="rect"/>
-                  </pic:spPr>
-                </pic:pic>
-              </a:graphicData>
-            </a:graphic>
-          </wp:inline>
-        </w:drawing>
-      </w:r>
-    </w:p>
-    <w:p>
-      <w:pPr>
-        <w:spacing w:line="240" w:lineRule="auto" w:before="60" w:after="180"/>
-        <w:jc w:val="center"/>
-      </w:pPr>
-      <w:r>
-        <w:rPr>
-          <w:rFonts w:ascii="Arial" w:hAnsi="Arial"/>
-          <w:b w:val="0"/>
-          <w:i w:val="0"/>
-          <w:sz w:val="20"/>
-        </w:rPr>
-        <w:t>Fonte: Autoria própria (2026).</w:t>
-      </w:r>
-    </w:p>
-    <w:p>
-      <w:pPr>
-        <w:keepNext/>
-        <w:spacing w:line="360" w:lineRule="auto" w:before="120" w:after="60"/>
-        <w:jc w:val="left"/>
-      </w:pPr>
-      <w:r>
-        <w:rPr>
-          <w:rFonts w:ascii="Arial" w:hAnsi="Arial"/>
-          <w:b w:val="0"/>
-          <w:i w:val="0"/>
-          <w:sz w:val="24"/>
-        </w:rPr>
-        <w:t>4.2.3 Tela de validação</w:t>
-      </w:r>
-    </w:p>
-    <w:p>
-      <w:pPr>
-        <w:spacing w:line="360" w:lineRule="auto" w:before="0" w:after="0"/>
-        <w:ind w:firstLine="709"/>
-        <w:jc w:val="both"/>
-      </w:pPr>
-      <w:r>
-        <w:rPr>
-          <w:rFonts w:ascii="Arial" w:hAnsi="Arial"/>
-          <w:b w:val="0"/>
-          <w:i w:val="0"/>
-          <w:sz w:val="24"/>
-        </w:rPr>
-        <w:t>O profissional de saúde valida o conjunto de parâmetros do ciclo (Figura 7), nunca um material individual (RN07). Ele pode aprovar, pedir revisão ou ajustar; um ajuste cria nova versão com justificativa obrigatória. Sem resposta em sete dias, a proposta expira e a versão anterior permanece vigente (RN05).</w:t>
-      </w:r>
-    </w:p>
-    <w:p>
-      <w:pPr>
-        <w:keepNext/>
-        <w:spacing w:line="240" w:lineRule="auto" w:before="120" w:after="60"/>
-        <w:jc w:val="center"/>
-      </w:pPr>
-      <w:r>
-        <w:rPr>
-          <w:rFonts w:ascii="Arial" w:hAnsi="Arial"/>
-          <w:b/>
-          <w:i w:val="0"/>
-          <w:sz w:val="20"/>
-        </w:rPr>
-        <w:t>Figura 7 – Validação dos parâmetros pelo profissional de saúde</w:t>
-      </w:r>
-    </w:p>
-    <w:p>
-      <w:pPr>
-        <w:keepNext/>
-        <w:spacing w:line="240" w:lineRule="auto" w:before="0" w:after="0"/>
-        <w:jc w:val="center"/>
-      </w:pPr>
-      <w:r>
-        <w:drawing>
-          <wp:inline xmlns:a="http://schemas.openxmlformats.org/drawingml/2006/main" xmlns:pic="http://schemas.openxmlformats.org/drawingml/2006/picture">
-            <wp:extent cx="5760000" cy="3600000"/>
-            <wp:docPr id="6" name="Picture 6"/>
-            <wp:cNvGraphicFramePr>
-              <a:graphicFrameLocks noChangeAspect="1"/>
-            </wp:cNvGraphicFramePr>
-            <a:graphic>
-              <a:graphicData uri="http://schemas.openxmlformats.org/drawingml/2006/picture">
-                <pic:pic>
-                  <pic:nvPicPr>
-                    <pic:cNvPr id="0" name="03-validar.png"/>
-                    <pic:cNvPicPr/>
-                  </pic:nvPicPr>
-                  <pic:blipFill>
-                    <a:blip r:embed="rId15"/>
-                    <a:stretch>
-                      <a:fillRect/>
-                    </a:stretch>
-                  </pic:blipFill>
-                  <pic:spPr>
-                    <a:xfrm>
-                      <a:off x="0" y="0"/>
-                      <a:ext cx="5760000" cy="3600000"/>
-                    </a:xfrm>
-                    <a:prstGeom prst="rect"/>
-                  </pic:spPr>
-                </pic:pic>
-              </a:graphicData>
-            </a:graphic>
-          </wp:inline>
-        </w:drawing>
-      </w:r>
-    </w:p>
-    <w:p>
-      <w:pPr>
-        <w:spacing w:line="240" w:lineRule="auto" w:before="60" w:after="180"/>
-        <w:jc w:val="center"/>
-      </w:pPr>
-      <w:r>
-        <w:rPr>
-          <w:rFonts w:ascii="Arial" w:hAnsi="Arial"/>
-          <w:b w:val="0"/>
-          <w:i w:val="0"/>
-          <w:sz w:val="20"/>
-        </w:rPr>
-        <w:t>Fonte: Autoria própria (2026).</w:t>
-      </w:r>
-    </w:p>
-    <w:p>
-      <w:pPr>
-        <w:keepNext/>
-        <w:spacing w:line="360" w:lineRule="auto" w:before="120" w:after="60"/>
-        <w:jc w:val="left"/>
-      </w:pPr>
-      <w:r>
-        <w:rPr>
-          <w:rFonts w:ascii="Arial" w:hAnsi="Arial"/>
-          <w:b w:val="0"/>
-          <w:i w:val="0"/>
-          <w:sz w:val="24"/>
-        </w:rPr>
-        <w:t>4.2.4 Telas de revisão e de material aprovado</w:t>
-      </w:r>
-    </w:p>
-    <w:p>
-      <w:pPr>
-        <w:spacing w:line="360" w:lineRule="auto" w:before="0" w:after="0"/>
-        <w:ind w:firstLine="709"/>
-        <w:jc w:val="both"/>
-      </w:pPr>
-      <w:r>
-        <w:rPr>
-          <w:rFonts w:ascii="Arial" w:hAnsi="Arial"/>
-          <w:b w:val="0"/>
-          <w:i w:val="0"/>
-          <w:sz w:val="24"/>
-        </w:rPr>
-        <w:t>O docente cola o texto da aula e recebe o rascunho adaptado, exibido ao lado do original para revisão e edição (Figura 8). O rascunho é visível apenas ao seu autor. Somente após a aprovação o material passa a ser visto pela família, pelo profissional e pela coordenação (Figura 9), com opção de leitura em voz alta por trecho e versão para impressão.</w:t>
-      </w:r>
-    </w:p>
-    <w:p>
-      <w:pPr>
-        <w:keepNext/>
-        <w:spacing w:line="240" w:lineRule="auto" w:before="120" w:after="60"/>
-        <w:jc w:val="center"/>
-      </w:pPr>
-      <w:r>
-        <w:rPr>
-          <w:rFonts w:ascii="Arial" w:hAnsi="Arial"/>
-          <w:b/>
-          <w:i w:val="0"/>
-          <w:sz w:val="20"/>
-        </w:rPr>
-        <w:t>Figura 8 – Revisão do material: original e adaptado lado a lado</w:t>
-      </w:r>
-    </w:p>
-    <w:p>
-      <w:pPr>
-        <w:keepNext/>
-        <w:spacing w:line="240" w:lineRule="auto" w:before="0" w:after="0"/>
-        <w:jc w:val="center"/>
-      </w:pPr>
-      <w:r>
-        <w:drawing>
-          <wp:inline xmlns:a="http://schemas.openxmlformats.org/drawingml/2006/main" xmlns:pic="http://schemas.openxmlformats.org/drawingml/2006/picture">
-            <wp:extent cx="5760000" cy="3600000"/>
-            <wp:docPr id="7" name="Picture 7"/>
-            <wp:cNvGraphicFramePr>
-              <a:graphicFrameLocks noChangeAspect="1"/>
-            </wp:cNvGraphicFramePr>
-            <a:graphic>
-              <a:graphicData uri="http://schemas.openxmlformats.org/drawingml/2006/picture">
-                <pic:pic>
-                  <pic:nvPicPr>
-                    <pic:cNvPr id="0" name="04-revisar.png"/>
                     <pic:cNvPicPr/>
                   </pic:nvPicPr>
                   <pic:blipFill>
@@ -8460,6 +8296,38 @@
     <w:p>
       <w:pPr>
         <w:keepNext/>
+        <w:spacing w:line="360" w:lineRule="auto" w:before="120" w:after="60"/>
+        <w:jc w:val="left"/>
+      </w:pPr>
+      <w:r>
+        <w:rPr>
+          <w:rFonts w:ascii="Arial" w:hAnsi="Arial"/>
+          <w:b w:val="0"/>
+          <w:i w:val="0"/>
+          <w:sz w:val="24"/>
+        </w:rPr>
+        <w:t>4.2.2 Tela de fechamento de ciclo</w:t>
+      </w:r>
+    </w:p>
+    <w:p>
+      <w:pPr>
+        <w:spacing w:line="360" w:lineRule="auto" w:before="0" w:after="0"/>
+        <w:ind w:firstLine="709"/>
+        <w:jc w:val="both"/>
+      </w:pPr>
+      <w:r>
+        <w:rPr>
+          <w:rFonts w:ascii="Arial" w:hAnsi="Arial"/>
+          <w:b w:val="0"/>
+          <w:i w:val="0"/>
+          <w:sz w:val="24"/>
+        </w:rPr>
+        <w:t>Ao fechar o ciclo (Figura 5), o docente vê a proposta de parâmetros calculada pelo motor, comparada com a versão vigente. No exemplo, o cansaço ampliado relatado pela família reduz de imediato o número de blocos por material, enquanto a melhora na autonomia com palavras aguarda um segundo ciclo para elevar o vocabulário, conforme a RN03.</w:t>
+      </w:r>
+    </w:p>
+    <w:p>
+      <w:pPr>
+        <w:keepNext/>
         <w:spacing w:line="240" w:lineRule="auto" w:before="120" w:after="60"/>
         <w:jc w:val="center"/>
       </w:pPr>
@@ -8470,7 +8338,7 @@
           <w:i w:val="0"/>
           <w:sz w:val="20"/>
         </w:rPr>
-        <w:t>Figura 9 – Material aprovado</w:t>
+        <w:t>Figura 5 – Fechamento de ciclo com a proposta de parâmetros</w:t>
       </w:r>
     </w:p>
     <w:p>
@@ -8483,7 +8351,7 @@
         <w:drawing>
           <wp:inline xmlns:a="http://schemas.openxmlformats.org/drawingml/2006/main" xmlns:pic="http://schemas.openxmlformats.org/drawingml/2006/picture">
             <wp:extent cx="5760000" cy="3600000"/>
-            <wp:docPr id="8" name="Picture 8"/>
+            <wp:docPr id="5" name="Picture 5"/>
             <wp:cNvGraphicFramePr>
               <a:graphicFrameLocks noChangeAspect="1"/>
             </wp:cNvGraphicFramePr>
@@ -8491,7 +8359,7 @@
               <a:graphicData uri="http://schemas.openxmlformats.org/drawingml/2006/picture">
                 <pic:pic>
                   <pic:nvPicPr>
-                    <pic:cNvPr id="0" name="05-material.png"/>
+                    <pic:cNvPr id="0" name="02-fechar-ciclo.png"/>
                     <pic:cNvPicPr/>
                   </pic:nvPicPr>
                   <pic:blipFill>
@@ -8542,7 +8410,7 @@
           <w:i w:val="0"/>
           <w:sz w:val="24"/>
         </w:rPr>
-        <w:t>4.2.5 Telas de privacidade e de acesso negado</w:t>
+        <w:t>4.2.3 Tela de validação</w:t>
       </w:r>
     </w:p>
     <w:p>
@@ -8558,7 +8426,7 @@
           <w:i w:val="0"/>
           <w:sz w:val="24"/>
         </w:rPr>
-        <w:t>Na tela de privacidade (Figura 10), o responsável vê quem tem acesso aos dados do estudante, o que cada pessoa pode ver e o histórico de acessos, e pode remover o acesso do profissional ou revogar o consentimento. A Figura 11 mostra o que ocorre quando o docente tenta abrir as notas reservadas do profissional: a interface apenas explica a negação, que é decidida pelo banco.</w:t>
+        <w:t>O profissional de saúde valida o conjunto de parâmetros do ciclo (Figura 6), nunca um material individual (RN07). Ele pode aprovar, pedir revisão ou ajustar; um ajuste cria nova versão com justificativa obrigatória. Sem resposta em sete dias, a proposta expira e a versão anterior permanece vigente (RN05).</w:t>
       </w:r>
     </w:p>
     <w:p>
@@ -8574,7 +8442,7 @@
           <w:i w:val="0"/>
           <w:sz w:val="20"/>
         </w:rPr>
-        <w:t>Figura 10 – Privacidade: quem tem acesso aos dados do estudante</w:t>
+        <w:t>Figura 6 – Validação dos parâmetros pelo profissional de saúde</w:t>
       </w:r>
     </w:p>
     <w:p>
@@ -8587,7 +8455,7 @@
         <w:drawing>
           <wp:inline xmlns:a="http://schemas.openxmlformats.org/drawingml/2006/main" xmlns:pic="http://schemas.openxmlformats.org/drawingml/2006/picture">
             <wp:extent cx="5760000" cy="3600000"/>
-            <wp:docPr id="9" name="Picture 9"/>
+            <wp:docPr id="6" name="Picture 6"/>
             <wp:cNvGraphicFramePr>
               <a:graphicFrameLocks noChangeAspect="1"/>
             </wp:cNvGraphicFramePr>
@@ -8595,7 +8463,7 @@
               <a:graphicData uri="http://schemas.openxmlformats.org/drawingml/2006/picture">
                 <pic:pic>
                   <pic:nvPicPr>
-                    <pic:cNvPr id="0" name="06-privacidade.png"/>
+                    <pic:cNvPr id="0" name="03-validar.png"/>
                     <pic:cNvPicPr/>
                   </pic:nvPicPr>
                   <pic:blipFill>
@@ -8636,6 +8504,38 @@
     <w:p>
       <w:pPr>
         <w:keepNext/>
+        <w:spacing w:line="360" w:lineRule="auto" w:before="120" w:after="60"/>
+        <w:jc w:val="left"/>
+      </w:pPr>
+      <w:r>
+        <w:rPr>
+          <w:rFonts w:ascii="Arial" w:hAnsi="Arial"/>
+          <w:b w:val="0"/>
+          <w:i w:val="0"/>
+          <w:sz w:val="24"/>
+        </w:rPr>
+        <w:t>4.2.4 Telas de revisão e de material aprovado</w:t>
+      </w:r>
+    </w:p>
+    <w:p>
+      <w:pPr>
+        <w:spacing w:line="360" w:lineRule="auto" w:before="0" w:after="0"/>
+        <w:ind w:firstLine="709"/>
+        <w:jc w:val="both"/>
+      </w:pPr>
+      <w:r>
+        <w:rPr>
+          <w:rFonts w:ascii="Arial" w:hAnsi="Arial"/>
+          <w:b w:val="0"/>
+          <w:i w:val="0"/>
+          <w:sz w:val="24"/>
+        </w:rPr>
+        <w:t>O docente cola o texto da aula e recebe o rascunho adaptado, exibido ao lado do original para revisão e edição (Figura 7). O rascunho é visível apenas ao seu autor. Somente após a aprovação o material passa a ser visto pela família, pelo profissional e pela coordenação (Figura 8), com opção de leitura em voz alta por trecho e versão para impressão.</w:t>
+      </w:r>
+    </w:p>
+    <w:p>
+      <w:pPr>
+        <w:keepNext/>
         <w:spacing w:line="240" w:lineRule="auto" w:before="120" w:after="60"/>
         <w:jc w:val="center"/>
       </w:pPr>
@@ -8646,7 +8546,255 @@
           <w:i w:val="0"/>
           <w:sz w:val="20"/>
         </w:rPr>
-        <w:t>Figura 11 – Acesso negado do docente às notas clínicas reservadas</w:t>
+        <w:t>Figura 7 – Revisão do material: original e adaptado lado a lado</w:t>
+      </w:r>
+    </w:p>
+    <w:p>
+      <w:pPr>
+        <w:keepNext/>
+        <w:spacing w:line="240" w:lineRule="auto" w:before="0" w:after="0"/>
+        <w:jc w:val="center"/>
+      </w:pPr>
+      <w:r>
+        <w:drawing>
+          <wp:inline xmlns:a="http://schemas.openxmlformats.org/drawingml/2006/main" xmlns:pic="http://schemas.openxmlformats.org/drawingml/2006/picture">
+            <wp:extent cx="5760000" cy="3600000"/>
+            <wp:docPr id="7" name="Picture 7"/>
+            <wp:cNvGraphicFramePr>
+              <a:graphicFrameLocks noChangeAspect="1"/>
+            </wp:cNvGraphicFramePr>
+            <a:graphic>
+              <a:graphicData uri="http://schemas.openxmlformats.org/drawingml/2006/picture">
+                <pic:pic>
+                  <pic:nvPicPr>
+                    <pic:cNvPr id="0" name="04-revisar.png"/>
+                    <pic:cNvPicPr/>
+                  </pic:nvPicPr>
+                  <pic:blipFill>
+                    <a:blip r:embed="rId19"/>
+                    <a:stretch>
+                      <a:fillRect/>
+                    </a:stretch>
+                  </pic:blipFill>
+                  <pic:spPr>
+                    <a:xfrm>
+                      <a:off x="0" y="0"/>
+                      <a:ext cx="5760000" cy="3600000"/>
+                    </a:xfrm>
+                    <a:prstGeom prst="rect"/>
+                  </pic:spPr>
+                </pic:pic>
+              </a:graphicData>
+            </a:graphic>
+          </wp:inline>
+        </w:drawing>
+      </w:r>
+    </w:p>
+    <w:p>
+      <w:pPr>
+        <w:spacing w:line="240" w:lineRule="auto" w:before="60" w:after="180"/>
+        <w:jc w:val="center"/>
+      </w:pPr>
+      <w:r>
+        <w:rPr>
+          <w:rFonts w:ascii="Arial" w:hAnsi="Arial"/>
+          <w:b w:val="0"/>
+          <w:i w:val="0"/>
+          <w:sz w:val="20"/>
+        </w:rPr>
+        <w:t>Fonte: Autoria própria (2026).</w:t>
+      </w:r>
+    </w:p>
+    <w:p>
+      <w:pPr>
+        <w:keepNext/>
+        <w:spacing w:line="240" w:lineRule="auto" w:before="120" w:after="60"/>
+        <w:jc w:val="center"/>
+      </w:pPr>
+      <w:r>
+        <w:rPr>
+          <w:rFonts w:ascii="Arial" w:hAnsi="Arial"/>
+          <w:b/>
+          <w:i w:val="0"/>
+          <w:sz w:val="20"/>
+        </w:rPr>
+        <w:t>Figura 8 – Material aprovado</w:t>
+      </w:r>
+    </w:p>
+    <w:p>
+      <w:pPr>
+        <w:keepNext/>
+        <w:spacing w:line="240" w:lineRule="auto" w:before="0" w:after="0"/>
+        <w:jc w:val="center"/>
+      </w:pPr>
+      <w:r>
+        <w:drawing>
+          <wp:inline xmlns:a="http://schemas.openxmlformats.org/drawingml/2006/main" xmlns:pic="http://schemas.openxmlformats.org/drawingml/2006/picture">
+            <wp:extent cx="5760000" cy="3600000"/>
+            <wp:docPr id="8" name="Picture 8"/>
+            <wp:cNvGraphicFramePr>
+              <a:graphicFrameLocks noChangeAspect="1"/>
+            </wp:cNvGraphicFramePr>
+            <a:graphic>
+              <a:graphicData uri="http://schemas.openxmlformats.org/drawingml/2006/picture">
+                <pic:pic>
+                  <pic:nvPicPr>
+                    <pic:cNvPr id="0" name="05-material.png"/>
+                    <pic:cNvPicPr/>
+                  </pic:nvPicPr>
+                  <pic:blipFill>
+                    <a:blip r:embed="rId20"/>
+                    <a:stretch>
+                      <a:fillRect/>
+                    </a:stretch>
+                  </pic:blipFill>
+                  <pic:spPr>
+                    <a:xfrm>
+                      <a:off x="0" y="0"/>
+                      <a:ext cx="5760000" cy="3600000"/>
+                    </a:xfrm>
+                    <a:prstGeom prst="rect"/>
+                  </pic:spPr>
+                </pic:pic>
+              </a:graphicData>
+            </a:graphic>
+          </wp:inline>
+        </w:drawing>
+      </w:r>
+    </w:p>
+    <w:p>
+      <w:pPr>
+        <w:spacing w:line="240" w:lineRule="auto" w:before="60" w:after="180"/>
+        <w:jc w:val="center"/>
+      </w:pPr>
+      <w:r>
+        <w:rPr>
+          <w:rFonts w:ascii="Arial" w:hAnsi="Arial"/>
+          <w:b w:val="0"/>
+          <w:i w:val="0"/>
+          <w:sz w:val="20"/>
+        </w:rPr>
+        <w:t>Fonte: Autoria própria (2026).</w:t>
+      </w:r>
+    </w:p>
+    <w:p>
+      <w:pPr>
+        <w:keepNext/>
+        <w:spacing w:line="360" w:lineRule="auto" w:before="120" w:after="60"/>
+        <w:jc w:val="left"/>
+      </w:pPr>
+      <w:r>
+        <w:rPr>
+          <w:rFonts w:ascii="Arial" w:hAnsi="Arial"/>
+          <w:b w:val="0"/>
+          <w:i w:val="0"/>
+          <w:sz w:val="24"/>
+        </w:rPr>
+        <w:t>4.2.5 Telas de privacidade e de acesso negado</w:t>
+      </w:r>
+    </w:p>
+    <w:p>
+      <w:pPr>
+        <w:spacing w:line="360" w:lineRule="auto" w:before="0" w:after="0"/>
+        <w:ind w:firstLine="709"/>
+        <w:jc w:val="both"/>
+      </w:pPr>
+      <w:r>
+        <w:rPr>
+          <w:rFonts w:ascii="Arial" w:hAnsi="Arial"/>
+          <w:b w:val="0"/>
+          <w:i w:val="0"/>
+          <w:sz w:val="24"/>
+        </w:rPr>
+        <w:t>Na tela de privacidade (Figura 9), o responsável vê quem tem acesso aos dados do estudante, o que cada pessoa pode ver e o histórico de acessos, e pode remover o acesso do profissional ou revogar o consentimento. A Figura 10 mostra o que ocorre quando o docente tenta abrir as notas reservadas do profissional: a interface apenas explica a negação, que é decidida pelo banco.</w:t>
+      </w:r>
+    </w:p>
+    <w:p>
+      <w:pPr>
+        <w:keepNext/>
+        <w:spacing w:line="240" w:lineRule="auto" w:before="120" w:after="60"/>
+        <w:jc w:val="center"/>
+      </w:pPr>
+      <w:r>
+        <w:rPr>
+          <w:rFonts w:ascii="Arial" w:hAnsi="Arial"/>
+          <w:b/>
+          <w:i w:val="0"/>
+          <w:sz w:val="20"/>
+        </w:rPr>
+        <w:t>Figura 9 – Privacidade: quem tem acesso aos dados do estudante</w:t>
+      </w:r>
+    </w:p>
+    <w:p>
+      <w:pPr>
+        <w:keepNext/>
+        <w:spacing w:line="240" w:lineRule="auto" w:before="0" w:after="0"/>
+        <w:jc w:val="center"/>
+      </w:pPr>
+      <w:r>
+        <w:drawing>
+          <wp:inline xmlns:a="http://schemas.openxmlformats.org/drawingml/2006/main" xmlns:pic="http://schemas.openxmlformats.org/drawingml/2006/picture">
+            <wp:extent cx="5760000" cy="3600000"/>
+            <wp:docPr id="9" name="Picture 9"/>
+            <wp:cNvGraphicFramePr>
+              <a:graphicFrameLocks noChangeAspect="1"/>
+            </wp:cNvGraphicFramePr>
+            <a:graphic>
+              <a:graphicData uri="http://schemas.openxmlformats.org/drawingml/2006/picture">
+                <pic:pic>
+                  <pic:nvPicPr>
+                    <pic:cNvPr id="0" name="06-privacidade.png"/>
+                    <pic:cNvPicPr/>
+                  </pic:nvPicPr>
+                  <pic:blipFill>
+                    <a:blip r:embed="rId21"/>
+                    <a:stretch>
+                      <a:fillRect/>
+                    </a:stretch>
+                  </pic:blipFill>
+                  <pic:spPr>
+                    <a:xfrm>
+                      <a:off x="0" y="0"/>
+                      <a:ext cx="5760000" cy="3600000"/>
+                    </a:xfrm>
+                    <a:prstGeom prst="rect"/>
+                  </pic:spPr>
+                </pic:pic>
+              </a:graphicData>
+            </a:graphic>
+          </wp:inline>
+        </w:drawing>
+      </w:r>
+    </w:p>
+    <w:p>
+      <w:pPr>
+        <w:spacing w:line="240" w:lineRule="auto" w:before="60" w:after="180"/>
+        <w:jc w:val="center"/>
+      </w:pPr>
+      <w:r>
+        <w:rPr>
+          <w:rFonts w:ascii="Arial" w:hAnsi="Arial"/>
+          <w:b w:val="0"/>
+          <w:i w:val="0"/>
+          <w:sz w:val="20"/>
+        </w:rPr>
+        <w:t>Fonte: Autoria própria (2026).</w:t>
+      </w:r>
+    </w:p>
+    <w:p>
+      <w:pPr>
+        <w:keepNext/>
+        <w:spacing w:line="240" w:lineRule="auto" w:before="120" w:after="60"/>
+        <w:jc w:val="center"/>
+      </w:pPr>
+      <w:r>
+        <w:rPr>
+          <w:rFonts w:ascii="Arial" w:hAnsi="Arial"/>
+          <w:b/>
+          <w:i w:val="0"/>
+          <w:sz w:val="20"/>
+        </w:rPr>
+        <w:t>Figura 10 – Acesso negado do docente às notas clínicas reservadas</w:t>
       </w:r>
     </w:p>
     <w:p>
@@ -8671,7 +8819,7 @@
                     <pic:cNvPicPr/>
                   </pic:nvPicPr>
                   <pic:blipFill>
-                    <a:blip r:embed="rId19"/>
+                    <a:blip r:embed="rId22"/>
                     <a:stretch>
                       <a:fillRect/>
                     </a:stretch>
@@ -10419,7 +10567,7 @@
                 <w:i w:val="0"/>
                 <w:sz w:val="20"/>
               </w:rPr>
-              <w:t>Índice de Flesch adaptado ao português (MARTINS et al., 1996), antes e depois</w:t>
+              <w:t>Índice de Flesch adaptado ao português (Martins et al., 1996), antes e depois</w:t>
             </w:r>
           </w:p>
         </w:tc>
@@ -10510,7 +10658,7 @@
           <w:i w:val="0"/>
           <w:sz w:val="24"/>
         </w:rPr>
-        <w:t>A comparação com as soluções semelhantes (Quadro 1) evidencia a diferença central do PEI Vivo. A Prova Adaptada parametriza a adaptação pela categoria diagnóstica; o motor deste trabalho a parametriza por observações datadas e atribuíveis a quem as registrou, acumuladas ciclo a ciclo, o que se traduz no código na contagem de ciclos consecutivos exibida na Figura 4. O Vínculoo centraliza documentos sem gerar conteúdo, enquanto o PEI Vivo converte o registro em material entregue ao estudante. Frontline e Goalbook tratam a conformidade legal como fim; no PEI Vivo, a arquitetura de permissões é o meio que viabiliza, com segurança, a participação da rede de saúde exigida pela Lei nº 14.254/2021.</w:t>
+        <w:t>A comparação com as soluções semelhantes (Quadro 1) evidencia a diferença central do PEI Vivo. A Prova Adaptada adapta o material por IA a partir das necessidades informadas pelo docente; o motor deste trabalho a parametriza por observações datadas e atribuíveis a quem as registrou, acumuladas ciclo a ciclo, o que se traduz no código na contagem de ciclos consecutivos exibida no Código 1. O Vínculoo também adapta atividades com IA, mas a partir de laudos e documentos importados; o PEI Vivo não armazena laudo, e a adaptação decorre de regras auditáveis aplicadas a observações e validadas pela saúde. Frontline e Goalbook tratam a conformidade legal como fim; no PEI Vivo, a arquitetura de permissões é o meio que viabiliza, com segurança, a participação da rede de saúde exigida pela Lei nº 14.254/2021.</w:t>
       </w:r>
     </w:p>
     <w:p>
@@ -10729,7 +10877,7 @@
           <w:i w:val="0"/>
           <w:sz w:val="24"/>
         </w:rPr>
-        <w:t>Manual diagnóstico e estatístico de transtornos mentais: DSM-5-TR</w:t>
+        <w:t>Manual diagnóstico e estatístico de transtornos mentais</w:t>
       </w:r>
       <w:r>
         <w:rPr>
@@ -10738,7 +10886,7 @@
           <w:i w:val="0"/>
           <w:sz w:val="24"/>
         </w:rPr>
-        <w:t>. 5. ed., texto revisado. Porto Alegre: Artmed, 2023.</w:t>
+        <w:t>: DSM-5-TR. 5. ed., texto revisado. Porto Alegre: Artmed, 2023.</w:t>
       </w:r>
     </w:p>
     <w:p>
@@ -10804,7 +10952,7 @@
           <w:i w:val="0"/>
           <w:sz w:val="24"/>
         </w:rPr>
-        <w:t>, v. 28, n. 57, p. 1-23, 2024.</w:t>
+        <w:t>, [Teresina], v. 28, n. 57, p. 1-23, 2024.</w:t>
       </w:r>
     </w:p>
     <w:p>
@@ -10819,7 +10967,7 @@
           <w:i w:val="0"/>
           <w:sz w:val="24"/>
         </w:rPr>
-        <w:t xml:space="preserve">BRASIL. Conselho Nacional de Saúde. </w:t>
+        <w:t xml:space="preserve">BRASIL. Conselho Nacional de Saúde. Resolução nº 510, de 7 de abril de 2016. Dispõe sobre as normas aplicáveis a pesquisas em Ciências Humanas e Sociais. </w:t>
       </w:r>
       <w:r>
         <w:rPr>
@@ -10828,7 +10976,7 @@
           <w:i w:val="0"/>
           <w:sz w:val="24"/>
         </w:rPr>
-        <w:t>Resolução nº 510, de 7 de abril de 2016</w:t>
+        <w:t>Diário Oficial da União</w:t>
       </w:r>
       <w:r>
         <w:rPr>
@@ -10837,7 +10985,7 @@
           <w:i w:val="0"/>
           <w:sz w:val="24"/>
         </w:rPr>
-        <w:t>. Dispõe sobre as normas aplicáveis a pesquisas em Ciências Humanas e Sociais. Brasília, DF: CNS, 2016.</w:t>
+        <w:t>: seção 1, Brasília, DF, p. 44-46, 24 maio 2016.</w:t>
       </w:r>
     </w:p>
     <w:p>
@@ -10870,7 +11018,7 @@
           <w:i w:val="0"/>
           <w:sz w:val="24"/>
         </w:rPr>
-        <w:t>. Institui a Lei Brasileira de Inclusão da Pessoa com Deficiência. Brasília, DF: Presidência da República, 2015.</w:t>
+        <w:t>. Institui a Lei Brasileira de Inclusão da Pessoa com Deficiência (Estatuto da Pessoa com Deficiência). Brasília, DF: Presidência da República, [2015]. Disponível em: https://www.planalto.gov.br/ccivil_03/_ato2015-2018/2015/lei/l13146.htm. Acesso em: 13 out. 2026.</w:t>
       </w:r>
     </w:p>
     <w:p>
@@ -10903,7 +11051,7 @@
           <w:i w:val="0"/>
           <w:sz w:val="24"/>
         </w:rPr>
-        <w:t>. Lei Geral de Proteção de Dados Pessoais. Brasília, DF: Presidência da República, 2018.</w:t>
+        <w:t>. Lei Geral de Proteção de Dados Pessoais (LGPD). Brasília, DF: Presidência da República, [2018]. Disponível em: https://www.planalto.gov.br/ccivil_03/_ato2015-2018/2018/lei/l13709.htm. Acesso em: 13 out. 2026.</w:t>
       </w:r>
     </w:p>
     <w:p>
@@ -10936,7 +11084,7 @@
           <w:i w:val="0"/>
           <w:sz w:val="24"/>
         </w:rPr>
-        <w:t>. Dispõe sobre o acompanhamento integral para educandos com dislexia ou Transtorno do Déficit de Atenção com Hiperatividade (TDAH) ou outro transtorno de aprendizagem. Brasília, DF: Presidência da República, 2021.</w:t>
+        <w:t>. Dispõe sobre o acompanhamento integral para educandos com dislexia ou Transtorno do Déficit de Atenção com Hiperatividade (TDAH) ou outro transtorno de aprendizagem. Brasília, DF: Presidência da República, [2021]. Disponível em: https://www.planalto.gov.br/ccivil_03/_ato2019-2022/2021/lei/l14254.htm. Acesso em: 13 out. 2026.</w:t>
       </w:r>
     </w:p>
     <w:p>
@@ -11002,26 +11150,7 @@
           <w:i w:val="0"/>
           <w:sz w:val="24"/>
         </w:rPr>
-        <w:t xml:space="preserve">. Wakefield, MA: CAST, 2018. Disponível em: &lt;https://udlguidelines.cast.org&gt;. Acesso em: </w:t>
-      </w:r>
-      <w:r>
-        <w:rPr>
-          <w:rFonts w:ascii="Arial" w:hAnsi="Arial"/>
-          <w:b w:val="0"/>
-          <w:i w:val="0"/>
-          <w:sz w:val="24"/>
-          <w:highlight w:val="yellow"/>
-        </w:rPr>
-        <w:t>[PREENCHER]</w:t>
-      </w:r>
-      <w:r>
-        <w:rPr>
-          <w:rFonts w:ascii="Arial" w:hAnsi="Arial"/>
-          <w:b w:val="0"/>
-          <w:i w:val="0"/>
-          <w:sz w:val="24"/>
-        </w:rPr>
-        <w:t>.</w:t>
+        <w:t>. Wakefield, MA: CAST, 2018. Disponível em: https://udlguidelines.cast.org. Acesso em: 13 out. 2026.</w:t>
       </w:r>
     </w:p>
     <w:p>
@@ -11087,7 +11216,7 @@
           <w:i w:val="0"/>
           <w:sz w:val="24"/>
         </w:rPr>
-        <w:t>, v. 20, 2022.</w:t>
+        <w:t>, Marechal Cândido Rondon, v. 20, 2022.</w:t>
       </w:r>
     </w:p>
     <w:p>
@@ -11111,7 +11240,7 @@
           <w:i w:val="0"/>
           <w:sz w:val="24"/>
         </w:rPr>
-        <w:t>Special Education Management</w:t>
+        <w:t>IEP and Special Education Management</w:t>
       </w:r>
       <w:r>
         <w:rPr>
@@ -11120,45 +11249,7 @@
           <w:i w:val="0"/>
           <w:sz w:val="24"/>
         </w:rPr>
-        <w:t xml:space="preserve">. [S. l.], 2026. Disponível em: </w:t>
-      </w:r>
-      <w:r>
-        <w:rPr>
-          <w:rFonts w:ascii="Arial" w:hAnsi="Arial"/>
-          <w:b w:val="0"/>
-          <w:i w:val="0"/>
-          <w:sz w:val="24"/>
-          <w:highlight w:val="yellow"/>
-        </w:rPr>
-        <w:t>[PREENCHER: URL]</w:t>
-      </w:r>
-      <w:r>
-        <w:rPr>
-          <w:rFonts w:ascii="Arial" w:hAnsi="Arial"/>
-          <w:b w:val="0"/>
-          <w:i w:val="0"/>
-          <w:sz w:val="24"/>
-        </w:rPr>
-        <w:t xml:space="preserve">. Acesso em: </w:t>
-      </w:r>
-      <w:r>
-        <w:rPr>
-          <w:rFonts w:ascii="Arial" w:hAnsi="Arial"/>
-          <w:b w:val="0"/>
-          <w:i w:val="0"/>
-          <w:sz w:val="24"/>
-          <w:highlight w:val="yellow"/>
-        </w:rPr>
-        <w:t>[PREENCHER]</w:t>
-      </w:r>
-      <w:r>
-        <w:rPr>
-          <w:rFonts w:ascii="Arial" w:hAnsi="Arial"/>
-          <w:b w:val="0"/>
-          <w:i w:val="0"/>
-          <w:sz w:val="24"/>
-        </w:rPr>
-        <w:t>.</w:t>
+        <w:t>. [S. l.], 2026. Disponível em: https://www.frontlineeducation.com/special-programs/special-ed-software/iep-management/. Acesso em: 13 out. 2026.</w:t>
       </w:r>
     </w:p>
     <w:p>
@@ -11191,45 +11282,7 @@
           <w:i w:val="0"/>
           <w:sz w:val="24"/>
         </w:rPr>
-        <w:t xml:space="preserve">. [S. l.], 2026. Disponível em: </w:t>
-      </w:r>
-      <w:r>
-        <w:rPr>
-          <w:rFonts w:ascii="Arial" w:hAnsi="Arial"/>
-          <w:b w:val="0"/>
-          <w:i w:val="0"/>
-          <w:sz w:val="24"/>
-          <w:highlight w:val="yellow"/>
-        </w:rPr>
-        <w:t>[PREENCHER: URL]</w:t>
-      </w:r>
-      <w:r>
-        <w:rPr>
-          <w:rFonts w:ascii="Arial" w:hAnsi="Arial"/>
-          <w:b w:val="0"/>
-          <w:i w:val="0"/>
-          <w:sz w:val="24"/>
-        </w:rPr>
-        <w:t xml:space="preserve">. Acesso em: </w:t>
-      </w:r>
-      <w:r>
-        <w:rPr>
-          <w:rFonts w:ascii="Arial" w:hAnsi="Arial"/>
-          <w:b w:val="0"/>
-          <w:i w:val="0"/>
-          <w:sz w:val="24"/>
-          <w:highlight w:val="yellow"/>
-        </w:rPr>
-        <w:t>[PREENCHER]</w:t>
-      </w:r>
-      <w:r>
-        <w:rPr>
-          <w:rFonts w:ascii="Arial" w:hAnsi="Arial"/>
-          <w:b w:val="0"/>
-          <w:i w:val="0"/>
-          <w:sz w:val="24"/>
-        </w:rPr>
-        <w:t>.</w:t>
+        <w:t>. [S. l.], 2026. Disponível em: https://goalbook.com/explore-toolkit/. Acesso em: 13 out. 2026.</w:t>
       </w:r>
     </w:p>
     <w:p>
@@ -11262,7 +11315,7 @@
           <w:i w:val="0"/>
           <w:sz w:val="24"/>
         </w:rPr>
-        <w:t>, v. 28, n. 1, p. 75-105, 2004.</w:t>
+        <w:t>, Minneapolis, v. 28, n. 1, p. 75-105, 2004.</w:t>
       </w:r>
     </w:p>
     <w:p>
@@ -11277,7 +11330,7 @@
           <w:i w:val="0"/>
           <w:sz w:val="24"/>
         </w:rPr>
-        <w:t xml:space="preserve">INSTITUTO NACIONAL DE ESTUDOS E PESQUISAS EDUCACIONAIS ANÍSIO TEIXEIRA. </w:t>
+        <w:t xml:space="preserve">INSTITUTO NACIONAL DE ESTUDOS E PESQUISAS EDUCACIONAIS ANÍSIO TEIXEIRA (INEP). </w:t>
       </w:r>
       <w:r>
         <w:rPr>
@@ -11295,7 +11348,45 @@
           <w:i w:val="0"/>
           <w:sz w:val="24"/>
         </w:rPr>
-        <w:t>: Censo Escolar da Educação Básica 2025. Brasília, DF: Inep, 2026.</w:t>
+        <w:t xml:space="preserve">: Censo Escolar da Educação Básica 2025. Brasília, DF: Inep, 2026. Disponível em: </w:t>
+      </w:r>
+      <w:r>
+        <w:rPr>
+          <w:rFonts w:ascii="Arial" w:hAnsi="Arial"/>
+          <w:b w:val="0"/>
+          <w:i w:val="0"/>
+          <w:sz w:val="24"/>
+          <w:highlight w:val="yellow"/>
+        </w:rPr>
+        <w:t>[CONFERIR: link da publicação no portal gov.br/inep, de onde saíram os dados de 2,5 milhões, 82% e 11,3%]</w:t>
+      </w:r>
+      <w:r>
+        <w:rPr>
+          <w:rFonts w:ascii="Arial" w:hAnsi="Arial"/>
+          <w:b w:val="0"/>
+          <w:i w:val="0"/>
+          <w:sz w:val="24"/>
+        </w:rPr>
+        <w:t xml:space="preserve">. Acesso em: </w:t>
+      </w:r>
+      <w:r>
+        <w:rPr>
+          <w:rFonts w:ascii="Arial" w:hAnsi="Arial"/>
+          <w:b w:val="0"/>
+          <w:i w:val="0"/>
+          <w:sz w:val="24"/>
+          <w:highlight w:val="yellow"/>
+        </w:rPr>
+        <w:t>[CONFERIR]</w:t>
+      </w:r>
+      <w:r>
+        <w:rPr>
+          <w:rFonts w:ascii="Arial" w:hAnsi="Arial"/>
+          <w:b w:val="0"/>
+          <w:i w:val="0"/>
+          <w:sz w:val="24"/>
+        </w:rPr>
+        <w:t>.</w:t>
       </w:r>
     </w:p>
     <w:p>
@@ -11404,7 +11495,7 @@
           <w:i w:val="0"/>
           <w:sz w:val="24"/>
         </w:rPr>
-        <w:t>, v. 29, 2023.</w:t>
+        <w:t>, Bauru, v. 29, 2023.</w:t>
       </w:r>
     </w:p>
     <w:p>
@@ -11437,7 +11528,7 @@
           <w:i w:val="0"/>
           <w:sz w:val="24"/>
         </w:rPr>
-        <w:t>: a Agenda 2030 para o Desenvolvimento Sustentável. Nova York: ONU, 2015.</w:t>
+        <w:t>: a Agenda 2030 para o Desenvolvimento Sustentável. Nova York: ONU, 2015. Disponível em: https://brasil.un.org/pt-br/91863-agenda-2030-para-o-desenvolvimento-sustent%C3%A1vel. Acesso em: 13 out. 2026.</w:t>
       </w:r>
     </w:p>
     <w:p>
@@ -11470,7 +11561,7 @@
           <w:i w:val="0"/>
           <w:sz w:val="24"/>
         </w:rPr>
-        <w:t>, v. 19, n. 1, 2022.</w:t>
+        <w:t>, Presidente Prudente, v. 19, n. 1, 2022.</w:t>
       </w:r>
     </w:p>
     <w:p>
@@ -11503,26 +11594,7 @@
           <w:i w:val="0"/>
           <w:sz w:val="24"/>
         </w:rPr>
-        <w:t xml:space="preserve">: row security policies. [S. l.], 2025. Disponível em: &lt;https://www.postgresql.org/docs/current/ddl-rowsecurity.html&gt;. Acesso em: </w:t>
-      </w:r>
-      <w:r>
-        <w:rPr>
-          <w:rFonts w:ascii="Arial" w:hAnsi="Arial"/>
-          <w:b w:val="0"/>
-          <w:i w:val="0"/>
-          <w:sz w:val="24"/>
-          <w:highlight w:val="yellow"/>
-        </w:rPr>
-        <w:t>[PREENCHER]</w:t>
-      </w:r>
-      <w:r>
-        <w:rPr>
-          <w:rFonts w:ascii="Arial" w:hAnsi="Arial"/>
-          <w:b w:val="0"/>
-          <w:i w:val="0"/>
-          <w:sz w:val="24"/>
-        </w:rPr>
-        <w:t>.</w:t>
+        <w:t>: row security policies. [S. l.], 2025. Disponível em: https://www.postgresql.org/docs/current/ddl-rowsecurity.html. Acesso em: 13 out. 2026.</w:t>
       </w:r>
     </w:p>
     <w:p>
@@ -11555,7 +11627,7 @@
           <w:i w:val="0"/>
           <w:sz w:val="24"/>
         </w:rPr>
-        <w:t>: métodos e técnicas da pesquisa e do trabalho acadêmico. 2. ed. Novo Hamburgo: Feevale, 2013.</w:t>
+        <w:t>: métodos e técnicas da pesquisa e do trabalho acadêmico. 2. ed. Novo Hamburgo: Feevale, 2013. E-book. Disponível em: https://www.feevale.br/Comum/midias/0163c988-1f5d-496f-b118-a6e009a7a2f9/E-book%20Metodologia%20do%20Trabalho%20Cientifico.pdf. Acesso em: 13 out. 2026.</w:t>
       </w:r>
     </w:p>
     <w:p>
@@ -11579,7 +11651,7 @@
           <w:i w:val="0"/>
           <w:sz w:val="24"/>
         </w:rPr>
-        <w:t>Prova Adaptada</w:t>
+        <w:t>IncluiAI</w:t>
       </w:r>
       <w:r>
         <w:rPr>
@@ -11588,45 +11660,7 @@
           <w:i w:val="0"/>
           <w:sz w:val="24"/>
         </w:rPr>
-        <w:t xml:space="preserve">. [S. l.], 2026. Disponível em: </w:t>
-      </w:r>
-      <w:r>
-        <w:rPr>
-          <w:rFonts w:ascii="Arial" w:hAnsi="Arial"/>
-          <w:b w:val="0"/>
-          <w:i w:val="0"/>
-          <w:sz w:val="24"/>
-          <w:highlight w:val="yellow"/>
-        </w:rPr>
-        <w:t>[PREENCHER: URL]</w:t>
-      </w:r>
-      <w:r>
-        <w:rPr>
-          <w:rFonts w:ascii="Arial" w:hAnsi="Arial"/>
-          <w:b w:val="0"/>
-          <w:i w:val="0"/>
-          <w:sz w:val="24"/>
-        </w:rPr>
-        <w:t xml:space="preserve">. Acesso em: </w:t>
-      </w:r>
-      <w:r>
-        <w:rPr>
-          <w:rFonts w:ascii="Arial" w:hAnsi="Arial"/>
-          <w:b w:val="0"/>
-          <w:i w:val="0"/>
-          <w:sz w:val="24"/>
-          <w:highlight w:val="yellow"/>
-        </w:rPr>
-        <w:t>[PREENCHER]</w:t>
-      </w:r>
-      <w:r>
-        <w:rPr>
-          <w:rFonts w:ascii="Arial" w:hAnsi="Arial"/>
-          <w:b w:val="0"/>
-          <w:i w:val="0"/>
-          <w:sz w:val="24"/>
-        </w:rPr>
-        <w:t>.</w:t>
+        <w:t>: Prova Adaptada. [S. l.], 2026. Disponível em: https://incluiai.com.br/. Acesso em: 13 out. 2026.</w:t>
       </w:r>
     </w:p>
     <w:p>
@@ -11725,26 +11759,7 @@
           <w:i w:val="0"/>
           <w:sz w:val="24"/>
         </w:rPr>
-        <w:t xml:space="preserve">: row level security. [S. l.], 2025. Disponível em: &lt;https://supabase.com/docs/guides/database/postgres/row-level-security&gt;. Acesso em: </w:t>
-      </w:r>
-      <w:r>
-        <w:rPr>
-          <w:rFonts w:ascii="Arial" w:hAnsi="Arial"/>
-          <w:b w:val="0"/>
-          <w:i w:val="0"/>
-          <w:sz w:val="24"/>
-          <w:highlight w:val="yellow"/>
-        </w:rPr>
-        <w:t>[PREENCHER]</w:t>
-      </w:r>
-      <w:r>
-        <w:rPr>
-          <w:rFonts w:ascii="Arial" w:hAnsi="Arial"/>
-          <w:b w:val="0"/>
-          <w:i w:val="0"/>
-          <w:sz w:val="24"/>
-        </w:rPr>
-        <w:t>.</w:t>
+        <w:t>: row level security. [S. l.], 2025. Disponível em: https://supabase.com/docs/guides/database/postgres/row-level-security. Acesso em: 13 out. 2026.</w:t>
       </w:r>
     </w:p>
     <w:p>
@@ -11777,45 +11792,7 @@
           <w:i w:val="0"/>
           <w:sz w:val="24"/>
         </w:rPr>
-        <w:t xml:space="preserve">. [S. l.], 2026. Disponível em: </w:t>
-      </w:r>
-      <w:r>
-        <w:rPr>
-          <w:rFonts w:ascii="Arial" w:hAnsi="Arial"/>
-          <w:b w:val="0"/>
-          <w:i w:val="0"/>
-          <w:sz w:val="24"/>
-          <w:highlight w:val="yellow"/>
-        </w:rPr>
-        <w:t>[PREENCHER: URL]</w:t>
-      </w:r>
-      <w:r>
-        <w:rPr>
-          <w:rFonts w:ascii="Arial" w:hAnsi="Arial"/>
-          <w:b w:val="0"/>
-          <w:i w:val="0"/>
-          <w:sz w:val="24"/>
-        </w:rPr>
-        <w:t xml:space="preserve">. Acesso em: </w:t>
-      </w:r>
-      <w:r>
-        <w:rPr>
-          <w:rFonts w:ascii="Arial" w:hAnsi="Arial"/>
-          <w:b w:val="0"/>
-          <w:i w:val="0"/>
-          <w:sz w:val="24"/>
-          <w:highlight w:val="yellow"/>
-        </w:rPr>
-        <w:t>[PREENCHER]</w:t>
-      </w:r>
-      <w:r>
-        <w:rPr>
-          <w:rFonts w:ascii="Arial" w:hAnsi="Arial"/>
-          <w:b w:val="0"/>
-          <w:i w:val="0"/>
-          <w:sz w:val="24"/>
-        </w:rPr>
-        <w:t>.</w:t>
+        <w:t>: educação especial e inclusiva. [S. l.], 2026. Disponível em: https://vinculoo.com.br/. Acesso em: 13 out. 2026.</w:t>
       </w:r>
     </w:p>
     <w:p>
@@ -11848,7 +11825,7 @@
           <w:i w:val="0"/>
           <w:sz w:val="24"/>
         </w:rPr>
-        <w:t>. W3C Recommendation, 5 out. 2023, atualizada em 12 dez. 2024. Disponível em: &lt;https://www.w3.org/TR/WCAG22/&gt;. Acesso em: 21 set. 2026.</w:t>
+        <w:t>. W3C Recommendation, 5 out. 2023, atualizada em 12 dez. 2024. Disponível em: https://www.w3.org/TR/WCAG22/. Acesso em: 13 out. 2026.</w:t>
       </w:r>
     </w:p>
     <w:sectPr>

</xml_diff>